<commit_message>
Add schema validation kernel
validate_schema compares an actual Arrow schema against an expected one and
returns a SchemaDiff (missing/unexpected/retyped/nullability-tightened
columns) rather than a bare bool, so a caller can tell a breaking change from
additive schema evolution. Numeric widening is opt-in and conservative
(narrower types, cross-signedness, and int-to-float are never accepted);
nullability is checked in the one direction that can break a caller.

Exposed to Python as witchhat.validate_schema / witchhat.SchemaDiff, with
SchemaDiff.retyped returning real pyarrow.DataType objects via arrow's
pyarrow bridge. 20 Rust unit tests plus 7 doctests, full rustdoc, and
docs/architecture.md + api.md + operations.md updated (with regenerated
.docx) to the same standard as the hashing kernel.

Co-Authored-By: Claude Sonnet 5 <noreply@anthropic.com>
</commit_message>
<xml_diff>
--- a/docs/api.docx
+++ b/docs/api.docx
@@ -49,7 +49,7 @@
           <w:rFonts w:ascii="Times New Roman" w:hAnsi="Times New Roman" w:eastAsia="Batang"/>
           <w:sz w:val="22"/>
         </w:rPr>
-        <w:t xml:space="preserve"> Describes the surface as built: composite hashing and schema/CPU introspection only. </w:t>
+        <w:t xml:space="preserve"> Describes the surface as built: composite hashing, schema validation, and schema/CPU introspection. </w:t>
       </w:r>
       <w:r>
         <w:rPr>
@@ -122,7 +122,7 @@
           <w:rFonts w:ascii="Times New Roman" w:hAnsi="Times New Roman" w:eastAsia="Batang"/>
           <w:sz w:val="22"/>
         </w:rPr>
-        <w:t xml:space="preserve"> 1.0 </w:t>
+        <w:t xml:space="preserve"> 1.1 </w:t>
       </w:r>
       <w:r>
         <w:rPr>
@@ -317,7 +317,7 @@
           <w:rFonts w:ascii="Consolas" w:hAnsi="Consolas" w:eastAsia="Consolas"/>
           <w:sz w:val="18"/>
         </w:rPr>
-        <w:t>cpu_features</w:t>
+        <w:t>validate_schema</w:t>
       </w:r>
       <w:r>
         <w:rPr>
@@ -331,7 +331,7 @@
           <w:rFonts w:ascii="Consolas" w:hAnsi="Consolas" w:eastAsia="Consolas"/>
           <w:sz w:val="18"/>
         </w:rPr>
-        <w:t>CpuFeatures</w:t>
+        <w:t>SchemaDiff</w:t>
       </w:r>
     </w:p>
     <w:p>
@@ -344,7 +344,28 @@
           <w:rFonts w:ascii="Times New Roman" w:hAnsi="Times New Roman" w:eastAsia="Batang"/>
           <w:sz w:val="22"/>
         </w:rPr>
-        <w:t>III. Rust Surface</w:t>
+        <w:t xml:space="preserve">7. </w:t>
+      </w:r>
+      <w:r>
+        <w:rPr>
+          <w:rFonts w:ascii="Consolas" w:hAnsi="Consolas" w:eastAsia="Consolas"/>
+          <w:sz w:val="18"/>
+        </w:rPr>
+        <w:t>cpu_features</w:t>
+      </w:r>
+      <w:r>
+        <w:rPr>
+          <w:rFonts w:ascii="Times New Roman" w:hAnsi="Times New Roman" w:eastAsia="Batang"/>
+          <w:sz w:val="22"/>
+        </w:rPr>
+        <w:t xml:space="preserve"> and </w:t>
+      </w:r>
+      <w:r>
+        <w:rPr>
+          <w:rFonts w:ascii="Consolas" w:hAnsi="Consolas" w:eastAsia="Consolas"/>
+          <w:sz w:val="18"/>
+        </w:rPr>
+        <w:t>CpuFeatures</w:t>
       </w:r>
     </w:p>
     <w:p>
@@ -357,7 +378,7 @@
           <w:rFonts w:ascii="Times New Roman" w:hAnsi="Times New Roman" w:eastAsia="Batang"/>
           <w:sz w:val="22"/>
         </w:rPr>
-        <w:t>1. Entry points</w:t>
+        <w:t>III. Rust Surface</w:t>
       </w:r>
     </w:p>
     <w:p>
@@ -370,14 +391,7 @@
           <w:rFonts w:ascii="Times New Roman" w:hAnsi="Times New Roman" w:eastAsia="Batang"/>
           <w:sz w:val="22"/>
         </w:rPr>
-        <w:t xml:space="preserve">2. </w:t>
-      </w:r>
-      <w:r>
-        <w:rPr>
-          <w:rFonts w:ascii="Consolas" w:hAnsi="Consolas" w:eastAsia="Consolas"/>
-          <w:sz w:val="18"/>
-        </w:rPr>
-        <w:t>HashVersion</w:t>
+        <w:t>1. Entry points</w:t>
       </w:r>
     </w:p>
     <w:p>
@@ -390,7 +404,14 @@
           <w:rFonts w:ascii="Times New Roman" w:hAnsi="Times New Roman" w:eastAsia="Batang"/>
           <w:sz w:val="22"/>
         </w:rPr>
-        <w:t>3. Module map</w:t>
+        <w:t xml:space="preserve">2. </w:t>
+      </w:r>
+      <w:r>
+        <w:rPr>
+          <w:rFonts w:ascii="Consolas" w:hAnsi="Consolas" w:eastAsia="Consolas"/>
+          <w:sz w:val="18"/>
+        </w:rPr>
+        <w:t>HashVersion</w:t>
       </w:r>
     </w:p>
     <w:p>
@@ -403,7 +424,28 @@
           <w:rFonts w:ascii="Times New Roman" w:hAnsi="Times New Roman" w:eastAsia="Batang"/>
           <w:sz w:val="22"/>
         </w:rPr>
-        <w:t>4. Error type</w:t>
+        <w:t xml:space="preserve">3. </w:t>
+      </w:r>
+      <w:r>
+        <w:rPr>
+          <w:rFonts w:ascii="Consolas" w:hAnsi="Consolas" w:eastAsia="Consolas"/>
+          <w:sz w:val="18"/>
+        </w:rPr>
+        <w:t>ValidateSchemaOptions</w:t>
+      </w:r>
+      <w:r>
+        <w:rPr>
+          <w:rFonts w:ascii="Times New Roman" w:hAnsi="Times New Roman" w:eastAsia="Batang"/>
+          <w:sz w:val="22"/>
+        </w:rPr>
+        <w:t xml:space="preserve"> and </w:t>
+      </w:r>
+      <w:r>
+        <w:rPr>
+          <w:rFonts w:ascii="Consolas" w:hAnsi="Consolas" w:eastAsia="Consolas"/>
+          <w:sz w:val="18"/>
+        </w:rPr>
+        <w:t>SchemaDiff</w:t>
       </w:r>
     </w:p>
     <w:p>
@@ -416,7 +458,7 @@
           <w:rFonts w:ascii="Times New Roman" w:hAnsi="Times New Roman" w:eastAsia="Batang"/>
           <w:sz w:val="22"/>
         </w:rPr>
-        <w:t>IV. Semantics Callers Must Know</w:t>
+        <w:t>4. Module map</w:t>
       </w:r>
     </w:p>
     <w:p>
@@ -429,7 +471,7 @@
           <w:rFonts w:ascii="Times New Roman" w:hAnsi="Times New Roman" w:eastAsia="Batang"/>
           <w:sz w:val="22"/>
         </w:rPr>
-        <w:t>1. Column order</w:t>
+        <w:t>5. Error type</w:t>
       </w:r>
     </w:p>
     <w:p>
@@ -442,7 +484,7 @@
           <w:rFonts w:ascii="Times New Roman" w:hAnsi="Times New Roman" w:eastAsia="Batang"/>
           <w:sz w:val="22"/>
         </w:rPr>
-        <w:t>2. Null and float equality</w:t>
+        <w:t>IV. Semantics Callers Must Know</w:t>
       </w:r>
     </w:p>
     <w:p>
@@ -455,7 +497,7 @@
           <w:rFonts w:ascii="Times New Roman" w:hAnsi="Times New Roman" w:eastAsia="Batang"/>
           <w:sz w:val="22"/>
         </w:rPr>
-        <w:t>3. Version pinning</w:t>
+        <w:t>1. Column order</w:t>
       </w:r>
     </w:p>
     <w:p>
@@ -468,7 +510,7 @@
           <w:rFonts w:ascii="Times New Roman" w:hAnsi="Times New Roman" w:eastAsia="Batang"/>
           <w:sz w:val="22"/>
         </w:rPr>
-        <w:t>4. What accepts non-pyarrow objects</w:t>
+        <w:t>2. Null and float equality</w:t>
       </w:r>
     </w:p>
     <w:p>
@@ -481,7 +523,7 @@
           <w:rFonts w:ascii="Times New Roman" w:hAnsi="Times New Roman" w:eastAsia="Batang"/>
           <w:sz w:val="22"/>
         </w:rPr>
-        <w:t>V. Worked Examples</w:t>
+        <w:t>3. Version pinning</w:t>
       </w:r>
     </w:p>
     <w:p>
@@ -494,7 +536,7 @@
           <w:rFonts w:ascii="Times New Roman" w:hAnsi="Times New Roman" w:eastAsia="Batang"/>
           <w:sz w:val="22"/>
         </w:rPr>
-        <w:t>1. Deduplicating rows</w:t>
+        <w:t>4. What accepts non-pyarrow objects</w:t>
       </w:r>
     </w:p>
     <w:p>
@@ -507,7 +549,21 @@
           <w:rFonts w:ascii="Times New Roman" w:hAnsi="Times New Roman" w:eastAsia="Batang"/>
           <w:sz w:val="22"/>
         </w:rPr>
-        <w:t>2. Checking output against Spark</w:t>
+        <w:t xml:space="preserve">5. </w:t>
+      </w:r>
+      <w:r>
+        <w:rPr>
+          <w:rFonts w:ascii="Consolas" w:hAnsi="Consolas" w:eastAsia="Consolas"/>
+          <w:sz w:val="18"/>
+        </w:rPr>
+        <w:t>validate_schema</w:t>
+      </w:r>
+      <w:r>
+        <w:rPr>
+          <w:rFonts w:ascii="Times New Roman" w:hAnsi="Times New Roman" w:eastAsia="Batang"/>
+          <w:sz w:val="22"/>
+        </w:rPr>
+        <w:t xml:space="preserve"> argument order</w:t>
       </w:r>
     </w:p>
     <w:p>
@@ -520,7 +576,7 @@
           <w:rFonts w:ascii="Times New Roman" w:hAnsi="Times New Roman" w:eastAsia="Batang"/>
           <w:sz w:val="22"/>
         </w:rPr>
-        <w:t>3. Calling from Rust</w:t>
+        <w:t>V. Worked Examples</w:t>
       </w:r>
     </w:p>
     <w:p>
@@ -533,7 +589,7 @@
           <w:rFonts w:ascii="Times New Roman" w:hAnsi="Times New Roman" w:eastAsia="Batang"/>
           <w:sz w:val="22"/>
         </w:rPr>
-        <w:t>References</w:t>
+        <w:t>1. Deduplicating rows</w:t>
       </w:r>
     </w:p>
     <w:p>
@@ -546,21 +602,7 @@
           <w:rFonts w:ascii="Times New Roman" w:hAnsi="Times New Roman" w:eastAsia="Batang"/>
           <w:sz w:val="22"/>
         </w:rPr>
-        <w:t>Appendix A. Parameter quick reference</w:t>
-      </w:r>
-    </w:p>
-    <w:p>
-      <w:pPr>
-        <w:pStyle w:val="Heading2"/>
-      </w:pPr>
-      <w:r>
-        <w:rPr>
-          <w:rFonts w:ascii="Times New Roman" w:hAnsi="Times New Roman" w:eastAsia="Batang"/>
-          <w:b/>
-          <w:color w:val="000000"/>
-          <w:sz w:val="24"/>
-        </w:rPr>
-        <w:t>List of Tables</w:t>
+        <w:t>2. Checking output against Spark</w:t>
       </w:r>
     </w:p>
     <w:p>
@@ -570,24 +612,10 @@
       </w:pPr>
       <w:r>
         <w:rPr>
-          <w:rFonts w:ascii="Consolas" w:hAnsi="Consolas" w:eastAsia="Consolas"/>
-          <w:sz w:val="18"/>
-        </w:rPr>
-        <w:t>&lt;Table 2-1&gt;</w:t>
-      </w:r>
-      <w:r>
-        <w:rPr>
           <w:rFonts w:ascii="Times New Roman" w:hAnsi="Times New Roman" w:eastAsia="Batang"/>
           <w:sz w:val="22"/>
         </w:rPr>
-        <w:t xml:space="preserve"> Parameters of </w:t>
-      </w:r>
-      <w:r>
-        <w:rPr>
-          <w:rFonts w:ascii="Consolas" w:hAnsi="Consolas" w:eastAsia="Consolas"/>
-          <w:sz w:val="18"/>
-        </w:rPr>
-        <w:t>hash_rows</w:t>
+        <w:t>3. Validating a batch before processing it</w:t>
       </w:r>
     </w:p>
     <w:p>
@@ -597,17 +625,124 @@
       </w:pPr>
       <w:r>
         <w:rPr>
+          <w:rFonts w:ascii="Times New Roman" w:hAnsi="Times New Roman" w:eastAsia="Batang"/>
+          <w:sz w:val="22"/>
+        </w:rPr>
+        <w:t>4. Calling from Rust</w:t>
+      </w:r>
+    </w:p>
+    <w:p>
+      <w:pPr>
+        <w:pStyle w:val="ListBullet"/>
+        <w:spacing w:line="384" w:lineRule="auto" w:after="120"/>
+      </w:pPr>
+      <w:r>
+        <w:rPr>
+          <w:rFonts w:ascii="Times New Roman" w:hAnsi="Times New Roman" w:eastAsia="Batang"/>
+          <w:sz w:val="22"/>
+        </w:rPr>
+        <w:t>References</w:t>
+      </w:r>
+    </w:p>
+    <w:p>
+      <w:pPr>
+        <w:pStyle w:val="ListBullet"/>
+        <w:spacing w:line="384" w:lineRule="auto" w:after="120"/>
+      </w:pPr>
+      <w:r>
+        <w:rPr>
+          <w:rFonts w:ascii="Times New Roman" w:hAnsi="Times New Roman" w:eastAsia="Batang"/>
+          <w:sz w:val="22"/>
+        </w:rPr>
+        <w:t>Appendix A. Parameter quick reference</w:t>
+      </w:r>
+    </w:p>
+    <w:p>
+      <w:pPr>
+        <w:pStyle w:val="Heading2"/>
+      </w:pPr>
+      <w:r>
+        <w:rPr>
+          <w:rFonts w:ascii="Times New Roman" w:hAnsi="Times New Roman" w:eastAsia="Batang"/>
+          <w:b/>
+          <w:color w:val="000000"/>
+          <w:sz w:val="24"/>
+        </w:rPr>
+        <w:t>List of Tables</w:t>
+      </w:r>
+    </w:p>
+    <w:p>
+      <w:pPr>
+        <w:pStyle w:val="ListBullet"/>
+        <w:spacing w:line="384" w:lineRule="auto" w:after="120"/>
+      </w:pPr>
+      <w:r>
+        <w:rPr>
           <w:rFonts w:ascii="Consolas" w:hAnsi="Consolas" w:eastAsia="Consolas"/>
           <w:sz w:val="18"/>
         </w:rPr>
-        <w:t>&lt;Table 2-2&gt;</w:t>
+        <w:t>&lt;Table 2-1&gt;</w:t>
       </w:r>
       <w:r>
         <w:rPr>
           <w:rFonts w:ascii="Times New Roman" w:hAnsi="Times New Roman" w:eastAsia="Batang"/>
           <w:sz w:val="22"/>
         </w:rPr>
+        <w:t xml:space="preserve"> Parameters of </w:t>
+      </w:r>
+      <w:r>
+        <w:rPr>
+          <w:rFonts w:ascii="Consolas" w:hAnsi="Consolas" w:eastAsia="Consolas"/>
+          <w:sz w:val="18"/>
+        </w:rPr>
+        <w:t>hash_rows</w:t>
+      </w:r>
+    </w:p>
+    <w:p>
+      <w:pPr>
+        <w:pStyle w:val="ListBullet"/>
+        <w:spacing w:line="384" w:lineRule="auto" w:after="120"/>
+      </w:pPr>
+      <w:r>
+        <w:rPr>
+          <w:rFonts w:ascii="Consolas" w:hAnsi="Consolas" w:eastAsia="Consolas"/>
+          <w:sz w:val="18"/>
+        </w:rPr>
+        <w:t>&lt;Table 2-2&gt;</w:t>
+      </w:r>
+      <w:r>
+        <w:rPr>
+          <w:rFonts w:ascii="Times New Roman" w:hAnsi="Times New Roman" w:eastAsia="Batang"/>
+          <w:sz w:val="22"/>
+        </w:rPr>
         <w:t xml:space="preserve"> Exceptions raised by the Python surface</w:t>
+      </w:r>
+    </w:p>
+    <w:p>
+      <w:pPr>
+        <w:pStyle w:val="ListBullet"/>
+        <w:spacing w:line="384" w:lineRule="auto" w:after="120"/>
+      </w:pPr>
+      <w:r>
+        <w:rPr>
+          <w:rFonts w:ascii="Consolas" w:hAnsi="Consolas" w:eastAsia="Consolas"/>
+          <w:sz w:val="18"/>
+        </w:rPr>
+        <w:t>&lt;Table 2-3&gt;</w:t>
+      </w:r>
+      <w:r>
+        <w:rPr>
+          <w:rFonts w:ascii="Times New Roman" w:hAnsi="Times New Roman" w:eastAsia="Batang"/>
+          <w:sz w:val="22"/>
+        </w:rPr>
+        <w:t xml:space="preserve"> Fields and methods of </w:t>
+      </w:r>
+      <w:r>
+        <w:rPr>
+          <w:rFonts w:ascii="Consolas" w:hAnsi="Consolas" w:eastAsia="Consolas"/>
+          <w:sz w:val="18"/>
+        </w:rPr>
+        <w:t>SchemaDiff</w:t>
       </w:r>
     </w:p>
     <w:p>
@@ -1415,6 +1550,54 @@
     <w:p/>
     <w:p>
       <w:pPr>
+        <w:spacing w:line="384" w:lineRule="auto" w:after="120"/>
+        <w:jc w:val="both"/>
+      </w:pPr>
+      <w:r>
+        <w:rPr>
+          <w:rFonts w:ascii="Consolas" w:hAnsi="Consolas" w:eastAsia="Consolas"/>
+          <w:sz w:val="18"/>
+        </w:rPr>
+        <w:t>validate_schema</w:t>
+      </w:r>
+      <w:r>
+        <w:rPr>
+          <w:rFonts w:ascii="Times New Roman" w:hAnsi="Times New Roman" w:eastAsia="Batang"/>
+          <w:sz w:val="22"/>
+        </w:rPr>
+        <w:t xml:space="preserve"> (Section 6) is the one exception: it never raises for a schema mismatch, since a difference is a normal, representable result, not a failure. It still raises </w:t>
+      </w:r>
+      <w:r>
+        <w:rPr>
+          <w:rFonts w:ascii="Consolas" w:hAnsi="Consolas" w:eastAsia="Consolas"/>
+          <w:sz w:val="18"/>
+        </w:rPr>
+        <w:t>TypeError</w:t>
+      </w:r>
+      <w:r>
+        <w:rPr>
+          <w:rFonts w:ascii="Times New Roman" w:hAnsi="Times New Roman" w:eastAsia="Batang"/>
+          <w:sz w:val="22"/>
+        </w:rPr>
+        <w:t>/</w:t>
+      </w:r>
+      <w:r>
+        <w:rPr>
+          <w:rFonts w:ascii="Consolas" w:hAnsi="Consolas" w:eastAsia="Consolas"/>
+          <w:sz w:val="18"/>
+        </w:rPr>
+        <w:t>ValueError</w:t>
+      </w:r>
+      <w:r>
+        <w:rPr>
+          <w:rFonts w:ascii="Times New Roman" w:hAnsi="Times New Roman" w:eastAsia="Batang"/>
+          <w:sz w:val="22"/>
+        </w:rPr>
+        <w:t xml:space="preserve"> for a malformed argument, like any Python function.</w:t>
+      </w:r>
+    </w:p>
+    <w:p>
+      <w:pPr>
         <w:pStyle w:val="Heading2"/>
       </w:pPr>
       <w:r>
@@ -1825,7 +2008,7 @@
           <w:color w:val="000000"/>
           <w:sz w:val="24"/>
         </w:rPr>
-        <w:t>cpu_features</w:t>
+        <w:t>validate_schema</w:t>
       </w:r>
       <w:r>
         <w:rPr>
@@ -1843,7 +2026,7 @@
           <w:color w:val="000000"/>
           <w:sz w:val="24"/>
         </w:rPr>
-        <w:t>CpuFeatures</w:t>
+        <w:t>SchemaDiff</w:t>
       </w:r>
     </w:p>
     <w:p>
@@ -1856,7 +2039,7 @@
           <w:rFonts w:ascii="Consolas" w:hAnsi="Consolas" w:eastAsia="Consolas"/>
           <w:sz w:val="18"/>
         </w:rPr>
-        <w:t>witchhat.cpu_features() -&gt; witchhat.CpuFeatures</w:t>
+        <w:t>witchhat.validate_schema(actual, expected, allow_numeric_widening=False) -&gt; witchhat.SchemaDiff</w:t>
       </w:r>
     </w:p>
     <w:p>
@@ -1869,91 +2052,756 @@
           <w:rFonts w:ascii="Times New Roman" w:hAnsi="Times New Roman" w:eastAsia="Batang"/>
           <w:sz w:val="22"/>
         </w:rPr>
-        <w:t xml:space="preserve">Returns a </w:t>
+        <w:t xml:space="preserve">Compares </w:t>
       </w:r>
       <w:r>
         <w:rPr>
           <w:rFonts w:ascii="Consolas" w:hAnsi="Consolas" w:eastAsia="Consolas"/>
           <w:sz w:val="18"/>
         </w:rPr>
-        <w:t>CpuFeatures</w:t>
+        <w:t>actual</w:t>
       </w:r>
       <w:r>
         <w:rPr>
           <w:rFonts w:ascii="Times New Roman" w:hAnsi="Times New Roman" w:eastAsia="Batang"/>
           <w:sz w:val="22"/>
         </w:rPr>
-        <w:t xml:space="preserve"> instance with boolean properties </w:t>
+        <w:t xml:space="preserve"> against </w:t>
       </w:r>
       <w:r>
         <w:rPr>
           <w:rFonts w:ascii="Consolas" w:hAnsi="Consolas" w:eastAsia="Consolas"/>
           <w:sz w:val="18"/>
         </w:rPr>
-        <w:t>sse42</w:t>
+        <w:t>expected</w:t>
       </w:r>
       <w:r>
         <w:rPr>
           <w:rFonts w:ascii="Times New Roman" w:hAnsi="Times New Roman" w:eastAsia="Batang"/>
           <w:sz w:val="22"/>
         </w:rPr>
-        <w:t xml:space="preserve">, </w:t>
+        <w:t xml:space="preserve">, column by column matched by name (case-sensitive), and returns a </w:t>
       </w:r>
       <w:r>
         <w:rPr>
           <w:rFonts w:ascii="Consolas" w:hAnsi="Consolas" w:eastAsia="Consolas"/>
           <w:sz w:val="18"/>
         </w:rPr>
-        <w:t>avx2</w:t>
+        <w:t>SchemaDiff</w:t>
       </w:r>
       <w:r>
         <w:rPr>
           <w:rFonts w:ascii="Times New Roman" w:hAnsi="Times New Roman" w:eastAsia="Batang"/>
           <w:sz w:val="22"/>
         </w:rPr>
-        <w:t xml:space="preserve">, </w:t>
+        <w:t xml:space="preserve"> describing exactly how they differ. Never raises for a mismatch; see </w:t>
       </w:r>
       <w:r>
         <w:rPr>
           <w:rFonts w:ascii="Consolas" w:hAnsi="Consolas" w:eastAsia="Consolas"/>
           <w:sz w:val="18"/>
         </w:rPr>
-        <w:t>avx512f</w:t>
+        <w:t>architecture.md</w:t>
       </w:r>
       <w:r>
         <w:rPr>
           <w:rFonts w:ascii="Times New Roman" w:hAnsi="Times New Roman" w:eastAsia="Batang"/>
           <w:sz w:val="22"/>
         </w:rPr>
-        <w:t xml:space="preserve">, </w:t>
+        <w:t xml:space="preserve"> Chapter IV for the full comparison rules (numeric widening, nullability direction).</w:t>
+      </w:r>
+    </w:p>
+    <w:p>
+      <w:pPr>
+        <w:spacing w:line="384" w:lineRule="auto" w:after="120"/>
+        <w:jc w:val="both"/>
+      </w:pPr>
+      <w:r>
+        <w:rPr>
+          <w:rFonts w:ascii="Times New Roman" w:hAnsi="Times New Roman" w:eastAsia="Batang"/>
+          <w:sz w:val="22"/>
+        </w:rPr>
+        <w:t xml:space="preserve">&lt;Table 2-3&gt; Fields and methods of </w:t>
       </w:r>
       <w:r>
         <w:rPr>
           <w:rFonts w:ascii="Consolas" w:hAnsi="Consolas" w:eastAsia="Consolas"/>
           <w:sz w:val="18"/>
         </w:rPr>
-        <w:t>neon</w:t>
+        <w:t>SchemaDiff</w:t>
+      </w:r>
+    </w:p>
+    <w:tbl>
+      <w:tblPr>
+        <w:tblStyle w:val="TableGrid"/>
+        <w:tblW w:type="auto" w:w="0"/>
+        <w:jc w:val="center"/>
+        <w:tblLook w:firstColumn="1" w:firstRow="1" w:lastColumn="0" w:lastRow="0" w:noHBand="0" w:noVBand="1" w:val="04A0"/>
+      </w:tblPr>
+      <w:tblGrid>
+        <w:gridCol w:w="3135"/>
+        <w:gridCol w:w="3135"/>
+        <w:gridCol w:w="3135"/>
+      </w:tblGrid>
+      <w:tr>
+        <w:tc>
+          <w:tcPr>
+            <w:tcW w:type="dxa" w:w="3135"/>
+          </w:tcPr>
+          <w:p>
+            <w:pPr>
+              <w:jc w:val="center"/>
+            </w:pPr>
+            <w:r>
+              <w:rPr>
+                <w:rFonts w:ascii="Times New Roman" w:hAnsi="Times New Roman" w:eastAsia="Batang"/>
+                <w:b/>
+                <w:sz w:val="22"/>
+              </w:rPr>
+              <w:t>Member</w:t>
+            </w:r>
+          </w:p>
+        </w:tc>
+        <w:tc>
+          <w:tcPr>
+            <w:tcW w:type="dxa" w:w="3135"/>
+          </w:tcPr>
+          <w:p>
+            <w:pPr>
+              <w:jc w:val="center"/>
+            </w:pPr>
+            <w:r>
+              <w:rPr>
+                <w:rFonts w:ascii="Times New Roman" w:hAnsi="Times New Roman" w:eastAsia="Batang"/>
+                <w:b/>
+                <w:sz w:val="22"/>
+              </w:rPr>
+              <w:t>Type</w:t>
+            </w:r>
+          </w:p>
+        </w:tc>
+        <w:tc>
+          <w:tcPr>
+            <w:tcW w:type="dxa" w:w="3135"/>
+          </w:tcPr>
+          <w:p>
+            <w:pPr>
+              <w:jc w:val="center"/>
+            </w:pPr>
+            <w:r>
+              <w:rPr>
+                <w:rFonts w:ascii="Times New Roman" w:hAnsi="Times New Roman" w:eastAsia="Batang"/>
+                <w:b/>
+                <w:sz w:val="22"/>
+              </w:rPr>
+              <w:t>Meaning</w:t>
+            </w:r>
+          </w:p>
+        </w:tc>
+      </w:tr>
+      <w:tr>
+        <w:tc>
+          <w:tcPr>
+            <w:tcW w:type="dxa" w:w="3135"/>
+          </w:tcPr>
+          <w:p>
+            <w:r>
+              <w:rPr>
+                <w:rFonts w:ascii="Consolas" w:hAnsi="Consolas" w:eastAsia="Consolas"/>
+                <w:sz w:val="18"/>
+              </w:rPr>
+              <w:t>.missing</w:t>
+            </w:r>
+          </w:p>
+        </w:tc>
+        <w:tc>
+          <w:tcPr>
+            <w:tcW w:type="dxa" w:w="3135"/>
+          </w:tcPr>
+          <w:p>
+            <w:r>
+              <w:rPr>
+                <w:rFonts w:ascii="Consolas" w:hAnsi="Consolas" w:eastAsia="Consolas"/>
+                <w:sz w:val="18"/>
+              </w:rPr>
+              <w:t>list[str]</w:t>
+            </w:r>
+          </w:p>
+        </w:tc>
+        <w:tc>
+          <w:tcPr>
+            <w:tcW w:type="dxa" w:w="3135"/>
+          </w:tcPr>
+          <w:p>
+            <w:r>
+              <w:rPr>
+                <w:rFonts w:ascii="Times New Roman" w:hAnsi="Times New Roman" w:eastAsia="Batang"/>
+                <w:sz w:val="22"/>
+              </w:rPr>
+              <w:t xml:space="preserve">Columns in </w:t>
+            </w:r>
+            <w:r>
+              <w:rPr>
+                <w:rFonts w:ascii="Consolas" w:hAnsi="Consolas" w:eastAsia="Consolas"/>
+                <w:sz w:val="18"/>
+              </w:rPr>
+              <w:t>expected</w:t>
+            </w:r>
+            <w:r>
+              <w:rPr>
+                <w:rFonts w:ascii="Times New Roman" w:hAnsi="Times New Roman" w:eastAsia="Batang"/>
+                <w:sz w:val="22"/>
+              </w:rPr>
+              <w:t xml:space="preserve">, absent from </w:t>
+            </w:r>
+            <w:r>
+              <w:rPr>
+                <w:rFonts w:ascii="Consolas" w:hAnsi="Consolas" w:eastAsia="Consolas"/>
+                <w:sz w:val="18"/>
+              </w:rPr>
+              <w:t>actual</w:t>
+            </w:r>
+          </w:p>
+        </w:tc>
+      </w:tr>
+      <w:tr>
+        <w:tc>
+          <w:tcPr>
+            <w:tcW w:type="dxa" w:w="3135"/>
+          </w:tcPr>
+          <w:p>
+            <w:r>
+              <w:rPr>
+                <w:rFonts w:ascii="Consolas" w:hAnsi="Consolas" w:eastAsia="Consolas"/>
+                <w:sz w:val="18"/>
+              </w:rPr>
+              <w:t>.unexpected</w:t>
+            </w:r>
+          </w:p>
+        </w:tc>
+        <w:tc>
+          <w:tcPr>
+            <w:tcW w:type="dxa" w:w="3135"/>
+          </w:tcPr>
+          <w:p>
+            <w:r>
+              <w:rPr>
+                <w:rFonts w:ascii="Consolas" w:hAnsi="Consolas" w:eastAsia="Consolas"/>
+                <w:sz w:val="18"/>
+              </w:rPr>
+              <w:t>list[str]</w:t>
+            </w:r>
+          </w:p>
+        </w:tc>
+        <w:tc>
+          <w:tcPr>
+            <w:tcW w:type="dxa" w:w="3135"/>
+          </w:tcPr>
+          <w:p>
+            <w:r>
+              <w:rPr>
+                <w:rFonts w:ascii="Times New Roman" w:hAnsi="Times New Roman" w:eastAsia="Batang"/>
+                <w:sz w:val="22"/>
+              </w:rPr>
+              <w:t xml:space="preserve">Columns in </w:t>
+            </w:r>
+            <w:r>
+              <w:rPr>
+                <w:rFonts w:ascii="Consolas" w:hAnsi="Consolas" w:eastAsia="Consolas"/>
+                <w:sz w:val="18"/>
+              </w:rPr>
+              <w:t>actual</w:t>
+            </w:r>
+            <w:r>
+              <w:rPr>
+                <w:rFonts w:ascii="Times New Roman" w:hAnsi="Times New Roman" w:eastAsia="Batang"/>
+                <w:sz w:val="22"/>
+              </w:rPr>
+              <w:t xml:space="preserve">, absent from </w:t>
+            </w:r>
+            <w:r>
+              <w:rPr>
+                <w:rFonts w:ascii="Consolas" w:hAnsi="Consolas" w:eastAsia="Consolas"/>
+                <w:sz w:val="18"/>
+              </w:rPr>
+              <w:t>expected</w:t>
+            </w:r>
+          </w:p>
+        </w:tc>
+      </w:tr>
+      <w:tr>
+        <w:tc>
+          <w:tcPr>
+            <w:tcW w:type="dxa" w:w="3135"/>
+          </w:tcPr>
+          <w:p>
+            <w:r>
+              <w:rPr>
+                <w:rFonts w:ascii="Consolas" w:hAnsi="Consolas" w:eastAsia="Consolas"/>
+                <w:sz w:val="18"/>
+              </w:rPr>
+              <w:t>.retyped</w:t>
+            </w:r>
+          </w:p>
+        </w:tc>
+        <w:tc>
+          <w:tcPr>
+            <w:tcW w:type="dxa" w:w="3135"/>
+          </w:tcPr>
+          <w:p>
+            <w:r>
+              <w:rPr>
+                <w:rFonts w:ascii="Consolas" w:hAnsi="Consolas" w:eastAsia="Consolas"/>
+                <w:sz w:val="18"/>
+              </w:rPr>
+              <w:t>list[tuple[str, pyarrow.DataType, pyarrow.DataType]]</w:t>
+            </w:r>
+          </w:p>
+        </w:tc>
+        <w:tc>
+          <w:tcPr>
+            <w:tcW w:type="dxa" w:w="3135"/>
+          </w:tcPr>
+          <w:p>
+            <w:r>
+              <w:rPr>
+                <w:rFonts w:ascii="Consolas" w:hAnsi="Consolas" w:eastAsia="Consolas"/>
+                <w:sz w:val="18"/>
+              </w:rPr>
+              <w:t>(column, expected_type, actual_type)</w:t>
+            </w:r>
+          </w:p>
+        </w:tc>
+      </w:tr>
+      <w:tr>
+        <w:tc>
+          <w:tcPr>
+            <w:tcW w:type="dxa" w:w="3135"/>
+          </w:tcPr>
+          <w:p>
+            <w:r>
+              <w:rPr>
+                <w:rFonts w:ascii="Consolas" w:hAnsi="Consolas" w:eastAsia="Consolas"/>
+                <w:sz w:val="18"/>
+              </w:rPr>
+              <w:t>.nullability</w:t>
+            </w:r>
+          </w:p>
+        </w:tc>
+        <w:tc>
+          <w:tcPr>
+            <w:tcW w:type="dxa" w:w="3135"/>
+          </w:tcPr>
+          <w:p>
+            <w:r>
+              <w:rPr>
+                <w:rFonts w:ascii="Consolas" w:hAnsi="Consolas" w:eastAsia="Consolas"/>
+                <w:sz w:val="18"/>
+              </w:rPr>
+              <w:t>list[tuple[str, bool, bool]]</w:t>
+            </w:r>
+          </w:p>
+        </w:tc>
+        <w:tc>
+          <w:tcPr>
+            <w:tcW w:type="dxa" w:w="3135"/>
+          </w:tcPr>
+          <w:p>
+            <w:r>
+              <w:rPr>
+                <w:rFonts w:ascii="Consolas" w:hAnsi="Consolas" w:eastAsia="Consolas"/>
+                <w:sz w:val="18"/>
+              </w:rPr>
+              <w:t>(column, expected_nullable, actual_nullable)</w:t>
+            </w:r>
+          </w:p>
+        </w:tc>
+      </w:tr>
+      <w:tr>
+        <w:tc>
+          <w:tcPr>
+            <w:tcW w:type="dxa" w:w="3135"/>
+          </w:tcPr>
+          <w:p>
+            <w:r>
+              <w:rPr>
+                <w:rFonts w:ascii="Consolas" w:hAnsi="Consolas" w:eastAsia="Consolas"/>
+                <w:sz w:val="18"/>
+              </w:rPr>
+              <w:t>.is_empty()</w:t>
+            </w:r>
+          </w:p>
+        </w:tc>
+        <w:tc>
+          <w:tcPr>
+            <w:tcW w:type="dxa" w:w="3135"/>
+          </w:tcPr>
+          <w:p>
+            <w:r>
+              <w:rPr>
+                <w:rFonts w:ascii="Consolas" w:hAnsi="Consolas" w:eastAsia="Consolas"/>
+                <w:sz w:val="18"/>
+              </w:rPr>
+              <w:t>bool</w:t>
+            </w:r>
+          </w:p>
+        </w:tc>
+        <w:tc>
+          <w:tcPr>
+            <w:tcW w:type="dxa" w:w="3135"/>
+          </w:tcPr>
+          <w:p>
+            <w:r>
+              <w:rPr>
+                <w:rFonts w:ascii="Times New Roman" w:hAnsi="Times New Roman" w:eastAsia="Batang"/>
+                <w:sz w:val="22"/>
+              </w:rPr>
+              <w:t xml:space="preserve">True if </w:t>
+            </w:r>
+            <w:r>
+              <w:rPr>
+                <w:rFonts w:ascii="Consolas" w:hAnsi="Consolas" w:eastAsia="Consolas"/>
+                <w:sz w:val="18"/>
+              </w:rPr>
+              <w:t>actual</w:t>
+            </w:r>
+            <w:r>
+              <w:rPr>
+                <w:rFonts w:ascii="Times New Roman" w:hAnsi="Times New Roman" w:eastAsia="Batang"/>
+                <w:sz w:val="22"/>
+              </w:rPr>
+              <w:t xml:space="preserve"> and </w:t>
+            </w:r>
+            <w:r>
+              <w:rPr>
+                <w:rFonts w:ascii="Consolas" w:hAnsi="Consolas" w:eastAsia="Consolas"/>
+                <w:sz w:val="18"/>
+              </w:rPr>
+              <w:t>expected</w:t>
+            </w:r>
+            <w:r>
+              <w:rPr>
+                <w:rFonts w:ascii="Times New Roman" w:hAnsi="Times New Roman" w:eastAsia="Batang"/>
+                <w:sz w:val="22"/>
+              </w:rPr>
+              <w:t xml:space="preserve"> agreed on every point checked</w:t>
+            </w:r>
+          </w:p>
+        </w:tc>
+      </w:tr>
+      <w:tr>
+        <w:tc>
+          <w:tcPr>
+            <w:tcW w:type="dxa" w:w="3135"/>
+          </w:tcPr>
+          <w:p>
+            <w:r>
+              <w:rPr>
+                <w:rFonts w:ascii="Consolas" w:hAnsi="Consolas" w:eastAsia="Consolas"/>
+                <w:sz w:val="18"/>
+              </w:rPr>
+              <w:t>.is_breaking()</w:t>
+            </w:r>
+          </w:p>
+        </w:tc>
+        <w:tc>
+          <w:tcPr>
+            <w:tcW w:type="dxa" w:w="3135"/>
+          </w:tcPr>
+          <w:p>
+            <w:r>
+              <w:rPr>
+                <w:rFonts w:ascii="Consolas" w:hAnsi="Consolas" w:eastAsia="Consolas"/>
+                <w:sz w:val="18"/>
+              </w:rPr>
+              <w:t>bool</w:t>
+            </w:r>
+          </w:p>
+        </w:tc>
+        <w:tc>
+          <w:tcPr>
+            <w:tcW w:type="dxa" w:w="3135"/>
+          </w:tcPr>
+          <w:p>
+            <w:r>
+              <w:rPr>
+                <w:rFonts w:ascii="Times New Roman" w:hAnsi="Times New Roman" w:eastAsia="Batang"/>
+                <w:sz w:val="22"/>
+              </w:rPr>
+              <w:t xml:space="preserve">True if </w:t>
+            </w:r>
+            <w:r>
+              <w:rPr>
+                <w:rFonts w:ascii="Consolas" w:hAnsi="Consolas" w:eastAsia="Consolas"/>
+                <w:sz w:val="18"/>
+              </w:rPr>
+              <w:t>missing</w:t>
+            </w:r>
+            <w:r>
+              <w:rPr>
+                <w:rFonts w:ascii="Times New Roman" w:hAnsi="Times New Roman" w:eastAsia="Batang"/>
+                <w:sz w:val="22"/>
+              </w:rPr>
+              <w:t xml:space="preserve">, </w:t>
+            </w:r>
+            <w:r>
+              <w:rPr>
+                <w:rFonts w:ascii="Consolas" w:hAnsi="Consolas" w:eastAsia="Consolas"/>
+                <w:sz w:val="18"/>
+              </w:rPr>
+              <w:t>retyped</w:t>
+            </w:r>
+            <w:r>
+              <w:rPr>
+                <w:rFonts w:ascii="Times New Roman" w:hAnsi="Times New Roman" w:eastAsia="Batang"/>
+                <w:sz w:val="22"/>
+              </w:rPr>
+              <w:t xml:space="preserve">, or </w:t>
+            </w:r>
+            <w:r>
+              <w:rPr>
+                <w:rFonts w:ascii="Consolas" w:hAnsi="Consolas" w:eastAsia="Consolas"/>
+                <w:sz w:val="18"/>
+              </w:rPr>
+              <w:t>nullability</w:t>
+            </w:r>
+            <w:r>
+              <w:rPr>
+                <w:rFonts w:ascii="Times New Roman" w:hAnsi="Times New Roman" w:eastAsia="Batang"/>
+                <w:sz w:val="22"/>
+              </w:rPr>
+              <w:t xml:space="preserve"> is non-empty; </w:t>
+            </w:r>
+            <w:r>
+              <w:rPr>
+                <w:rFonts w:ascii="Consolas" w:hAnsi="Consolas" w:eastAsia="Consolas"/>
+                <w:sz w:val="18"/>
+              </w:rPr>
+              <w:t>unexpected</w:t>
+            </w:r>
+            <w:r>
+              <w:rPr>
+                <w:rFonts w:ascii="Times New Roman" w:hAnsi="Times New Roman" w:eastAsia="Batang"/>
+                <w:sz w:val="22"/>
+              </w:rPr>
+              <w:t xml:space="preserve"> alone does not count</w:t>
+            </w:r>
+          </w:p>
+        </w:tc>
+      </w:tr>
+    </w:tbl>
+    <w:p/>
+    <w:p>
+      <w:pPr>
+        <w:spacing w:line="384" w:lineRule="auto" w:after="120"/>
+        <w:jc w:val="both"/>
+      </w:pPr>
+      <w:r>
+        <w:rPr>
+          <w:rFonts w:ascii="Consolas" w:hAnsi="Consolas" w:eastAsia="Consolas"/>
+          <w:sz w:val="18"/>
+        </w:rPr>
+        <w:t>.retyped</w:t>
       </w:r>
       <w:r>
         <w:rPr>
           <w:rFonts w:ascii="Times New Roman" w:hAnsi="Times New Roman" w:eastAsia="Batang"/>
           <w:sz w:val="22"/>
         </w:rPr>
-        <w:t xml:space="preserve">. See </w:t>
+        <w:t xml:space="preserve">'s type entries are real </w:t>
       </w:r>
       <w:r>
         <w:rPr>
           <w:rFonts w:ascii="Consolas" w:hAnsi="Consolas" w:eastAsia="Consolas"/>
           <w:sz w:val="18"/>
         </w:rPr>
-        <w:t>architecture.md</w:t>
+        <w:t>pyarrow.DataType</w:t>
       </w:r>
       <w:r>
         <w:rPr>
           <w:rFonts w:ascii="Times New Roman" w:hAnsi="Times New Roman" w:eastAsia="Batang"/>
           <w:sz w:val="22"/>
         </w:rPr>
-        <w:t xml:space="preserve"> Chapter IV for why this exists and what it does (and does not yet) affect.</w:t>
+        <w:t xml:space="preserve"> objects (</w:t>
+      </w:r>
+      <w:r>
+        <w:rPr>
+          <w:rFonts w:ascii="Consolas" w:hAnsi="Consolas" w:eastAsia="Consolas"/>
+          <w:sz w:val="18"/>
+        </w:rPr>
+        <w:t>arrow-rs</w:t>
+      </w:r>
+      <w:r>
+        <w:rPr>
+          <w:rFonts w:ascii="Times New Roman" w:hAnsi="Times New Roman" w:eastAsia="Batang"/>
+          <w:sz w:val="22"/>
+        </w:rPr>
+        <w:t xml:space="preserve">'s pyarrow bridge constructs them directly), not strings, so </w:t>
+      </w:r>
+      <w:r>
+        <w:rPr>
+          <w:rFonts w:ascii="Consolas" w:hAnsi="Consolas" w:eastAsia="Consolas"/>
+          <w:sz w:val="18"/>
+        </w:rPr>
+        <w:t>pyarrow.types.is_integer(...)</w:t>
+      </w:r>
+      <w:r>
+        <w:rPr>
+          <w:rFonts w:ascii="Times New Roman" w:hAnsi="Times New Roman" w:eastAsia="Batang"/>
+          <w:sz w:val="22"/>
+        </w:rPr>
+        <w:t xml:space="preserve"> and similar predicates work on them without parsing.</w:t>
+      </w:r>
+    </w:p>
+    <w:p>
+      <w:pPr>
+        <w:pStyle w:val="Heading2"/>
+      </w:pPr>
+      <w:r>
+        <w:rPr>
+          <w:rFonts w:ascii="Times New Roman" w:hAnsi="Times New Roman" w:eastAsia="Batang"/>
+          <w:b/>
+          <w:color w:val="000000"/>
+          <w:sz w:val="24"/>
+        </w:rPr>
+        <w:t xml:space="preserve">7. </w:t>
+      </w:r>
+      <w:r>
+        <w:rPr>
+          <w:rFonts w:ascii="Consolas" w:hAnsi="Consolas" w:eastAsia="Consolas"/>
+          <w:b/>
+          <w:color w:val="000000"/>
+          <w:sz w:val="24"/>
+        </w:rPr>
+        <w:t>cpu_features</w:t>
+      </w:r>
+      <w:r>
+        <w:rPr>
+          <w:rFonts w:ascii="Times New Roman" w:hAnsi="Times New Roman" w:eastAsia="Batang"/>
+          <w:b/>
+          <w:color w:val="000000"/>
+          <w:sz w:val="24"/>
+        </w:rPr>
+        <w:t xml:space="preserve"> and </w:t>
+      </w:r>
+      <w:r>
+        <w:rPr>
+          <w:rFonts w:ascii="Consolas" w:hAnsi="Consolas" w:eastAsia="Consolas"/>
+          <w:b/>
+          <w:color w:val="000000"/>
+          <w:sz w:val="24"/>
+        </w:rPr>
+        <w:t>CpuFeatures</w:t>
+      </w:r>
+    </w:p>
+    <w:p>
+      <w:pPr>
+        <w:spacing w:line="240" w:lineRule="auto" w:before="120" w:after="120"/>
+        <w:ind w:left="454"/>
+      </w:pPr>
+      <w:r>
+        <w:rPr>
+          <w:rFonts w:ascii="Consolas" w:hAnsi="Consolas" w:eastAsia="Consolas"/>
+          <w:sz w:val="18"/>
+        </w:rPr>
+        <w:t>witchhat.cpu_features() -&gt; witchhat.CpuFeatures</w:t>
+      </w:r>
+    </w:p>
+    <w:p>
+      <w:pPr>
+        <w:spacing w:line="384" w:lineRule="auto" w:after="120"/>
+        <w:jc w:val="both"/>
+      </w:pPr>
+      <w:r>
+        <w:rPr>
+          <w:rFonts w:ascii="Times New Roman" w:hAnsi="Times New Roman" w:eastAsia="Batang"/>
+          <w:sz w:val="22"/>
+        </w:rPr>
+        <w:t xml:space="preserve">Returns a </w:t>
+      </w:r>
+      <w:r>
+        <w:rPr>
+          <w:rFonts w:ascii="Consolas" w:hAnsi="Consolas" w:eastAsia="Consolas"/>
+          <w:sz w:val="18"/>
+        </w:rPr>
+        <w:t>CpuFeatures</w:t>
+      </w:r>
+      <w:r>
+        <w:rPr>
+          <w:rFonts w:ascii="Times New Roman" w:hAnsi="Times New Roman" w:eastAsia="Batang"/>
+          <w:sz w:val="22"/>
+        </w:rPr>
+        <w:t xml:space="preserve"> instance with boolean properties </w:t>
+      </w:r>
+      <w:r>
+        <w:rPr>
+          <w:rFonts w:ascii="Consolas" w:hAnsi="Consolas" w:eastAsia="Consolas"/>
+          <w:sz w:val="18"/>
+        </w:rPr>
+        <w:t>sse42</w:t>
+      </w:r>
+      <w:r>
+        <w:rPr>
+          <w:rFonts w:ascii="Times New Roman" w:hAnsi="Times New Roman" w:eastAsia="Batang"/>
+          <w:sz w:val="22"/>
+        </w:rPr>
+        <w:t xml:space="preserve">, </w:t>
+      </w:r>
+      <w:r>
+        <w:rPr>
+          <w:rFonts w:ascii="Consolas" w:hAnsi="Consolas" w:eastAsia="Consolas"/>
+          <w:sz w:val="18"/>
+        </w:rPr>
+        <w:t>avx2</w:t>
+      </w:r>
+      <w:r>
+        <w:rPr>
+          <w:rFonts w:ascii="Times New Roman" w:hAnsi="Times New Roman" w:eastAsia="Batang"/>
+          <w:sz w:val="22"/>
+        </w:rPr>
+        <w:t xml:space="preserve">, </w:t>
+      </w:r>
+      <w:r>
+        <w:rPr>
+          <w:rFonts w:ascii="Consolas" w:hAnsi="Consolas" w:eastAsia="Consolas"/>
+          <w:sz w:val="18"/>
+        </w:rPr>
+        <w:t>avx512f</w:t>
+      </w:r>
+      <w:r>
+        <w:rPr>
+          <w:rFonts w:ascii="Times New Roman" w:hAnsi="Times New Roman" w:eastAsia="Batang"/>
+          <w:sz w:val="22"/>
+        </w:rPr>
+        <w:t xml:space="preserve">, </w:t>
+      </w:r>
+      <w:r>
+        <w:rPr>
+          <w:rFonts w:ascii="Consolas" w:hAnsi="Consolas" w:eastAsia="Consolas"/>
+          <w:sz w:val="18"/>
+        </w:rPr>
+        <w:t>neon</w:t>
+      </w:r>
+      <w:r>
+        <w:rPr>
+          <w:rFonts w:ascii="Times New Roman" w:hAnsi="Times New Roman" w:eastAsia="Batang"/>
+          <w:sz w:val="22"/>
+        </w:rPr>
+        <w:t xml:space="preserve">. See </w:t>
+      </w:r>
+      <w:r>
+        <w:rPr>
+          <w:rFonts w:ascii="Consolas" w:hAnsi="Consolas" w:eastAsia="Consolas"/>
+          <w:sz w:val="18"/>
+        </w:rPr>
+        <w:t>architecture.md</w:t>
+      </w:r>
+      <w:r>
+        <w:rPr>
+          <w:rFonts w:ascii="Times New Roman" w:hAnsi="Times New Roman" w:eastAsia="Batang"/>
+          <w:sz w:val="22"/>
+        </w:rPr>
+        <w:t xml:space="preserve"> Chapter V for why this exists and what it does (and does not yet) affect.</w:t>
       </w:r>
     </w:p>
     <w:p>
@@ -2002,6 +2850,8 @@
         <w:br/>
         <w:t>witchhat_core::schema_fingerprint(schema: &amp;Schema, version: HashVersion) -&gt; u64</w:t>
         <w:br/>
+        <w:t>witchhat_core::validate_schema(actual: &amp;Schema, expected: &amp;Schema, options: ValidateSchemaOptions) -&gt; SchemaDiff</w:t>
+        <w:br/>
         <w:t>witchhat_core::features() -&gt; CpuFeatures</w:t>
       </w:r>
     </w:p>
@@ -2029,7 +2879,7 @@
           <w:rFonts w:ascii="Times New Roman" w:hAnsi="Times New Roman" w:eastAsia="Batang"/>
           <w:sz w:val="22"/>
         </w:rPr>
-        <w:t xml:space="preserve"> Chapter V for the concurrency model. Full rustdoc, including examples, is on every item (</w:t>
+        <w:t xml:space="preserve"> Chapter VI for the concurrency model. Full rustdoc, including examples, is on every item (</w:t>
       </w:r>
       <w:r>
         <w:rPr>
@@ -2103,7 +2953,87 @@
           <w:color w:val="000000"/>
           <w:sz w:val="24"/>
         </w:rPr>
-        <w:t>3. Module map</w:t>
+        <w:t xml:space="preserve">3. </w:t>
+      </w:r>
+      <w:r>
+        <w:rPr>
+          <w:rFonts w:ascii="Consolas" w:hAnsi="Consolas" w:eastAsia="Consolas"/>
+          <w:b/>
+          <w:color w:val="000000"/>
+          <w:sz w:val="24"/>
+        </w:rPr>
+        <w:t>ValidateSchemaOptions</w:t>
+      </w:r>
+      <w:r>
+        <w:rPr>
+          <w:rFonts w:ascii="Times New Roman" w:hAnsi="Times New Roman" w:eastAsia="Batang"/>
+          <w:b/>
+          <w:color w:val="000000"/>
+          <w:sz w:val="24"/>
+        </w:rPr>
+        <w:t xml:space="preserve"> and </w:t>
+      </w:r>
+      <w:r>
+        <w:rPr>
+          <w:rFonts w:ascii="Consolas" w:hAnsi="Consolas" w:eastAsia="Consolas"/>
+          <w:b/>
+          <w:color w:val="000000"/>
+          <w:sz w:val="24"/>
+        </w:rPr>
+        <w:t>SchemaDiff</w:t>
+      </w:r>
+    </w:p>
+    <w:p>
+      <w:pPr>
+        <w:spacing w:line="240" w:lineRule="auto" w:before="120" w:after="120"/>
+        <w:ind w:left="454"/>
+      </w:pPr>
+      <w:r>
+        <w:rPr>
+          <w:rFonts w:ascii="Consolas" w:hAnsi="Consolas" w:eastAsia="Consolas"/>
+          <w:sz w:val="18"/>
+        </w:rPr>
+        <w:t>pub struct ValidateSchemaOptions { pub allow_numeric_widening: bool }</w:t>
+        <w:br/>
+        <w:br/>
+        <w:t>pub struct SchemaDiff {</w:t>
+        <w:br/>
+        <w:t xml:space="preserve">    pub missing: Vec&lt;Arc&lt;str&gt;&gt;,</w:t>
+        <w:br/>
+        <w:t xml:space="preserve">    pub unexpected: Vec&lt;Arc&lt;str&gt;&gt;,</w:t>
+        <w:br/>
+        <w:t xml:space="preserve">    pub retyped: Vec&lt;RetypedColumn&gt;,</w:t>
+        <w:br/>
+        <w:t xml:space="preserve">    pub nullability: Vec&lt;NullabilityChange&gt;,</w:t>
+        <w:br/>
+        <w:t>}</w:t>
+        <w:br/>
+        <w:t>impl SchemaDiff {</w:t>
+        <w:br/>
+        <w:t xml:space="preserve">    pub fn is_empty(&amp;self) -&gt; bool;</w:t>
+        <w:br/>
+        <w:t xml:space="preserve">    pub fn is_breaking(&amp;self) -&gt; bool;</w:t>
+        <w:br/>
+        <w:t>}</w:t>
+        <w:br/>
+        <w:br/>
+        <w:t>pub struct RetypedColumn { pub column: Arc&lt;str&gt;, pub expected: DataType, pub actual: DataType }</w:t>
+        <w:br/>
+        <w:t>pub struct NullabilityChange { pub column: Arc&lt;str&gt;, pub expected_nullable: bool, pub actual_nullable: bool }</w:t>
+      </w:r>
+    </w:p>
+    <w:p>
+      <w:pPr>
+        <w:pStyle w:val="Heading2"/>
+      </w:pPr>
+      <w:r>
+        <w:rPr>
+          <w:rFonts w:ascii="Times New Roman" w:hAnsi="Times New Roman" w:eastAsia="Batang"/>
+          <w:b/>
+          <w:color w:val="000000"/>
+          <w:sz w:val="24"/>
+        </w:rPr>
+        <w:t>4. Module map</w:t>
       </w:r>
     </w:p>
     <w:p>
@@ -2288,6 +3218,92 @@
                 <w:rFonts w:ascii="Consolas" w:hAnsi="Consolas" w:eastAsia="Consolas"/>
                 <w:sz w:val="18"/>
               </w:rPr>
+              <w:t>witchhat_core::validate</w:t>
+            </w:r>
+          </w:p>
+        </w:tc>
+        <w:tc>
+          <w:tcPr>
+            <w:tcW w:type="dxa" w:w="4702"/>
+          </w:tcPr>
+          <w:p>
+            <w:r>
+              <w:rPr>
+                <w:rFonts w:ascii="Consolas" w:hAnsi="Consolas" w:eastAsia="Consolas"/>
+                <w:sz w:val="18"/>
+              </w:rPr>
+              <w:t>ValidateSchemaOptions</w:t>
+            </w:r>
+            <w:r>
+              <w:rPr>
+                <w:rFonts w:ascii="Times New Roman" w:hAnsi="Times New Roman" w:eastAsia="Batang"/>
+                <w:sz w:val="22"/>
+              </w:rPr>
+              <w:t xml:space="preserve">, </w:t>
+            </w:r>
+            <w:r>
+              <w:rPr>
+                <w:rFonts w:ascii="Consolas" w:hAnsi="Consolas" w:eastAsia="Consolas"/>
+                <w:sz w:val="18"/>
+              </w:rPr>
+              <w:t>SchemaDiff</w:t>
+            </w:r>
+            <w:r>
+              <w:rPr>
+                <w:rFonts w:ascii="Times New Roman" w:hAnsi="Times New Roman" w:eastAsia="Batang"/>
+                <w:sz w:val="22"/>
+              </w:rPr>
+              <w:t xml:space="preserve">, </w:t>
+            </w:r>
+            <w:r>
+              <w:rPr>
+                <w:rFonts w:ascii="Consolas" w:hAnsi="Consolas" w:eastAsia="Consolas"/>
+                <w:sz w:val="18"/>
+              </w:rPr>
+              <w:t>RetypedColumn</w:t>
+            </w:r>
+            <w:r>
+              <w:rPr>
+                <w:rFonts w:ascii="Times New Roman" w:hAnsi="Times New Roman" w:eastAsia="Batang"/>
+                <w:sz w:val="22"/>
+              </w:rPr>
+              <w:t xml:space="preserve">, </w:t>
+            </w:r>
+            <w:r>
+              <w:rPr>
+                <w:rFonts w:ascii="Consolas" w:hAnsi="Consolas" w:eastAsia="Consolas"/>
+                <w:sz w:val="18"/>
+              </w:rPr>
+              <w:t>NullabilityChange</w:t>
+            </w:r>
+            <w:r>
+              <w:rPr>
+                <w:rFonts w:ascii="Times New Roman" w:hAnsi="Times New Roman" w:eastAsia="Batang"/>
+                <w:sz w:val="22"/>
+              </w:rPr>
+              <w:t xml:space="preserve">, </w:t>
+            </w:r>
+            <w:r>
+              <w:rPr>
+                <w:rFonts w:ascii="Consolas" w:hAnsi="Consolas" w:eastAsia="Consolas"/>
+                <w:sz w:val="18"/>
+              </w:rPr>
+              <w:t>validate_schema</w:t>
+            </w:r>
+          </w:p>
+        </w:tc>
+      </w:tr>
+      <w:tr>
+        <w:tc>
+          <w:tcPr>
+            <w:tcW w:type="dxa" w:w="4702"/>
+          </w:tcPr>
+          <w:p>
+            <w:r>
+              <w:rPr>
+                <w:rFonts w:ascii="Consolas" w:hAnsi="Consolas" w:eastAsia="Consolas"/>
+                <w:sz w:val="18"/>
+              </w:rPr>
               <w:t>witchhat_core::cpu</w:t>
             </w:r>
           </w:p>
@@ -2378,7 +3394,7 @@
           <w:color w:val="000000"/>
           <w:sz w:val="24"/>
         </w:rPr>
-        <w:t>4. Error type</w:t>
+        <w:t>5. Error type</w:t>
       </w:r>
     </w:p>
     <w:p>
@@ -2524,7 +3540,63 @@
           <w:rFonts w:ascii="Times New Roman" w:hAnsi="Times New Roman" w:eastAsia="Batang"/>
           <w:sz w:val="22"/>
         </w:rPr>
-        <w:t xml:space="preserve"> Chapter VI.</w:t>
+        <w:t xml:space="preserve"> Chapter VII. </w:t>
+      </w:r>
+      <w:r>
+        <w:rPr>
+          <w:rFonts w:ascii="Consolas" w:hAnsi="Consolas" w:eastAsia="Consolas"/>
+          <w:sz w:val="18"/>
+        </w:rPr>
+        <w:t>validate_schema</w:t>
+      </w:r>
+      <w:r>
+        <w:rPr>
+          <w:rFonts w:ascii="Times New Roman" w:hAnsi="Times New Roman" w:eastAsia="Batang"/>
+          <w:sz w:val="22"/>
+        </w:rPr>
+        <w:t xml:space="preserve"> does not return </w:t>
+      </w:r>
+      <w:r>
+        <w:rPr>
+          <w:rFonts w:ascii="Consolas" w:hAnsi="Consolas" w:eastAsia="Consolas"/>
+          <w:sz w:val="18"/>
+        </w:rPr>
+        <w:t>Result</w:t>
+      </w:r>
+      <w:r>
+        <w:rPr>
+          <w:rFonts w:ascii="Times New Roman" w:hAnsi="Times New Roman" w:eastAsia="Batang"/>
+          <w:sz w:val="22"/>
+        </w:rPr>
+        <w:t xml:space="preserve">: an unequal schema is a normal result (a </w:t>
+      </w:r>
+      <w:r>
+        <w:rPr>
+          <w:rFonts w:ascii="Consolas" w:hAnsi="Consolas" w:eastAsia="Consolas"/>
+          <w:sz w:val="18"/>
+        </w:rPr>
+        <w:t>SchemaDiff</w:t>
+      </w:r>
+      <w:r>
+        <w:rPr>
+          <w:rFonts w:ascii="Times New Roman" w:hAnsi="Times New Roman" w:eastAsia="Batang"/>
+          <w:sz w:val="22"/>
+        </w:rPr>
+        <w:t xml:space="preserve">), not an </w:t>
+      </w:r>
+      <w:r>
+        <w:rPr>
+          <w:rFonts w:ascii="Consolas" w:hAnsi="Consolas" w:eastAsia="Consolas"/>
+          <w:sz w:val="18"/>
+        </w:rPr>
+        <w:t>Error</w:t>
+      </w:r>
+      <w:r>
+        <w:rPr>
+          <w:rFonts w:ascii="Times New Roman" w:hAnsi="Times New Roman" w:eastAsia="Batang"/>
+          <w:sz w:val="22"/>
+        </w:rPr>
+        <w:t>.</w:t>
       </w:r>
     </w:p>
     <w:p>
@@ -2752,7 +3824,21 @@
           <w:rFonts w:ascii="Times New Roman" w:hAnsi="Times New Roman" w:eastAsia="Batang"/>
           <w:sz w:val="22"/>
         </w:rPr>
-        <w:t xml:space="preserve"> default) anywhere a fingerprint is stored and compared against a value computed by a different call site or a later release, so an accidental version mismatch is visible immediately rather than producing a silent, wrong "not equal" result.</w:t>
+        <w:t xml:space="preserve"> default) anywhere a fingerprint is stored and compared against a value computed by a different call site or a later release, so an accidental version mismatch is visible immediately rather than producing a silent, wrong "not equal" result. </w:t>
+      </w:r>
+      <w:r>
+        <w:rPr>
+          <w:rFonts w:ascii="Consolas" w:hAnsi="Consolas" w:eastAsia="Consolas"/>
+          <w:sz w:val="18"/>
+        </w:rPr>
+        <w:t>validate_schema</w:t>
+      </w:r>
+      <w:r>
+        <w:rPr>
+          <w:rFonts w:ascii="Times New Roman" w:hAnsi="Times New Roman" w:eastAsia="Batang"/>
+          <w:sz w:val="22"/>
+        </w:rPr>
+        <w:t xml:space="preserve"> has no version parameter: schema comparison is a structural check, not a hash, so there is nothing to version yet.</w:t>
       </w:r>
     </w:p>
     <w:p>
@@ -2814,133 +3900,297 @@
           <w:rFonts w:ascii="Times New Roman" w:hAnsi="Times New Roman" w:eastAsia="Batang"/>
           <w:sz w:val="22"/>
         </w:rPr>
-        <w:t xml:space="preserve"> parameters accept anything implementing the relevant Arrow C Data method (</w:t>
+        <w:t>/</w:t>
       </w:r>
       <w:r>
         <w:rPr>
           <w:rFonts w:ascii="Consolas" w:hAnsi="Consolas" w:eastAsia="Consolas"/>
           <w:sz w:val="18"/>
         </w:rPr>
-        <w:t>__arrow_c_array__</w:t>
+        <w:t>actual</w:t>
       </w:r>
       <w:r>
         <w:rPr>
           <w:rFonts w:ascii="Times New Roman" w:hAnsi="Times New Roman" w:eastAsia="Batang"/>
           <w:sz w:val="22"/>
         </w:rPr>
-        <w:t xml:space="preserve"> or </w:t>
+        <w:t>/</w:t>
       </w:r>
       <w:r>
         <w:rPr>
           <w:rFonts w:ascii="Consolas" w:hAnsi="Consolas" w:eastAsia="Consolas"/>
           <w:sz w:val="18"/>
         </w:rPr>
-        <w:t>__arrow_c_schema__</w:t>
+        <w:t>expected</w:t>
       </w:r>
       <w:r>
         <w:rPr>
           <w:rFonts w:ascii="Times New Roman" w:hAnsi="Times New Roman" w:eastAsia="Batang"/>
           <w:sz w:val="22"/>
         </w:rPr>
-        <w:t xml:space="preserve">), not </w:t>
+        <w:t xml:space="preserve"> parameters accept anything implementing the relevant Arrow C Data method (</w:t>
       </w:r>
       <w:r>
         <w:rPr>
           <w:rFonts w:ascii="Consolas" w:hAnsi="Consolas" w:eastAsia="Consolas"/>
           <w:sz w:val="18"/>
         </w:rPr>
-        <w:t>pyarrow</w:t>
+        <w:t>__arrow_c_array__</w:t>
       </w:r>
       <w:r>
         <w:rPr>
           <w:rFonts w:ascii="Times New Roman" w:hAnsi="Times New Roman" w:eastAsia="Batang"/>
           <w:sz w:val="22"/>
         </w:rPr>
-        <w:t xml:space="preserve"> specifically: a </w:t>
+        <w:t xml:space="preserve"> or </w:t>
       </w:r>
       <w:r>
         <w:rPr>
           <w:rFonts w:ascii="Consolas" w:hAnsi="Consolas" w:eastAsia="Consolas"/>
           <w:sz w:val="18"/>
         </w:rPr>
-        <w:t>polars.DataFrame</w:t>
+        <w:t>__arrow_c_schema__</w:t>
       </w:r>
       <w:r>
         <w:rPr>
           <w:rFonts w:ascii="Times New Roman" w:hAnsi="Times New Roman" w:eastAsia="Batang"/>
           <w:sz w:val="22"/>
         </w:rPr>
-        <w:t xml:space="preserve">'s </w:t>
+        <w:t xml:space="preserve">), not </w:t>
       </w:r>
       <w:r>
         <w:rPr>
           <w:rFonts w:ascii="Consolas" w:hAnsi="Consolas" w:eastAsia="Consolas"/>
           <w:sz w:val="18"/>
         </w:rPr>
-        <w:t>to_arrow()</w:t>
+        <w:t>pyarrow</w:t>
       </w:r>
       <w:r>
         <w:rPr>
           <w:rFonts w:ascii="Times New Roman" w:hAnsi="Times New Roman" w:eastAsia="Batang"/>
           <w:sz w:val="22"/>
         </w:rPr>
-        <w:t xml:space="preserve"> result, for instance, satisfies this. witchhat never imports </w:t>
+        <w:t xml:space="preserve"> specifically: a </w:t>
       </w:r>
       <w:r>
         <w:rPr>
           <w:rFonts w:ascii="Consolas" w:hAnsi="Consolas" w:eastAsia="Consolas"/>
           <w:sz w:val="18"/>
         </w:rPr>
-        <w:t>pyarrow</w:t>
+        <w:t>polars.DataFrame</w:t>
       </w:r>
       <w:r>
         <w:rPr>
           <w:rFonts w:ascii="Times New Roman" w:hAnsi="Times New Roman" w:eastAsia="Batang"/>
           <w:sz w:val="22"/>
         </w:rPr>
-        <w:t xml:space="preserve"> itself; </w:t>
+        <w:t xml:space="preserve">'s </w:t>
       </w:r>
       <w:r>
         <w:rPr>
           <w:rFonts w:ascii="Consolas" w:hAnsi="Consolas" w:eastAsia="Consolas"/>
           <w:sz w:val="18"/>
         </w:rPr>
-        <w:t>hash_rows</w:t>
+        <w:t>to_arrow()</w:t>
       </w:r>
       <w:r>
         <w:rPr>
           <w:rFonts w:ascii="Times New Roman" w:hAnsi="Times New Roman" w:eastAsia="Batang"/>
           <w:sz w:val="22"/>
         </w:rPr>
-        <w:t xml:space="preserve">'s return value happens to be constructed as a </w:t>
+        <w:t xml:space="preserve"> result, for instance, satisfies this. witchhat never imports </w:t>
       </w:r>
       <w:r>
         <w:rPr>
           <w:rFonts w:ascii="Consolas" w:hAnsi="Consolas" w:eastAsia="Consolas"/>
           <w:sz w:val="18"/>
         </w:rPr>
-        <w:t>pyarrow.Array</w:t>
+        <w:t>pyarrow</w:t>
       </w:r>
       <w:r>
         <w:rPr>
           <w:rFonts w:ascii="Times New Roman" w:hAnsi="Times New Roman" w:eastAsia="Batang"/>
           <w:sz w:val="22"/>
         </w:rPr>
-        <w:t xml:space="preserve"> because that is what </w:t>
+        <w:t xml:space="preserve"> itself; </w:t>
       </w:r>
       <w:r>
         <w:rPr>
           <w:rFonts w:ascii="Consolas" w:hAnsi="Consolas" w:eastAsia="Consolas"/>
           <w:sz w:val="18"/>
         </w:rPr>
-        <w:t>arrow-rs</w:t>
+        <w:t>hash_rows</w:t>
       </w:r>
       <w:r>
         <w:rPr>
           <w:rFonts w:ascii="Times New Roman" w:hAnsi="Times New Roman" w:eastAsia="Batang"/>
           <w:sz w:val="22"/>
         </w:rPr>
+        <w:t xml:space="preserve">'s return value and </w:t>
+      </w:r>
+      <w:r>
+        <w:rPr>
+          <w:rFonts w:ascii="Consolas" w:hAnsi="Consolas" w:eastAsia="Consolas"/>
+          <w:sz w:val="18"/>
+        </w:rPr>
+        <w:t>SchemaDiff.retyped</w:t>
+      </w:r>
+      <w:r>
+        <w:rPr>
+          <w:rFonts w:ascii="Times New Roman" w:hAnsi="Times New Roman" w:eastAsia="Batang"/>
+          <w:sz w:val="22"/>
+        </w:rPr>
+        <w:t xml:space="preserve">'s type entries happen to be constructed as real </w:t>
+      </w:r>
+      <w:r>
+        <w:rPr>
+          <w:rFonts w:ascii="Consolas" w:hAnsi="Consolas" w:eastAsia="Consolas"/>
+          <w:sz w:val="18"/>
+        </w:rPr>
+        <w:t>pyarrow</w:t>
+      </w:r>
+      <w:r>
+        <w:rPr>
+          <w:rFonts w:ascii="Times New Roman" w:hAnsi="Times New Roman" w:eastAsia="Batang"/>
+          <w:sz w:val="22"/>
+        </w:rPr>
+        <w:t xml:space="preserve"> objects because that is what </w:t>
+      </w:r>
+      <w:r>
+        <w:rPr>
+          <w:rFonts w:ascii="Consolas" w:hAnsi="Consolas" w:eastAsia="Consolas"/>
+          <w:sz w:val="18"/>
+        </w:rPr>
+        <w:t>arrow-rs</w:t>
+      </w:r>
+      <w:r>
+        <w:rPr>
+          <w:rFonts w:ascii="Times New Roman" w:hAnsi="Times New Roman" w:eastAsia="Batang"/>
+          <w:sz w:val="22"/>
+        </w:rPr>
         <w:t>'s Python bridge produces on the export side.</w:t>
+      </w:r>
+    </w:p>
+    <w:p>
+      <w:pPr>
+        <w:pStyle w:val="Heading2"/>
+      </w:pPr>
+      <w:r>
+        <w:rPr>
+          <w:rFonts w:ascii="Times New Roman" w:hAnsi="Times New Roman" w:eastAsia="Batang"/>
+          <w:b/>
+          <w:color w:val="000000"/>
+          <w:sz w:val="24"/>
+        </w:rPr>
+        <w:t xml:space="preserve">5. </w:t>
+      </w:r>
+      <w:r>
+        <w:rPr>
+          <w:rFonts w:ascii="Consolas" w:hAnsi="Consolas" w:eastAsia="Consolas"/>
+          <w:b/>
+          <w:color w:val="000000"/>
+          <w:sz w:val="24"/>
+        </w:rPr>
+        <w:t>validate_schema</w:t>
+      </w:r>
+      <w:r>
+        <w:rPr>
+          <w:rFonts w:ascii="Times New Roman" w:hAnsi="Times New Roman" w:eastAsia="Batang"/>
+          <w:b/>
+          <w:color w:val="000000"/>
+          <w:sz w:val="24"/>
+        </w:rPr>
+        <w:t xml:space="preserve"> argument order</w:t>
+      </w:r>
+    </w:p>
+    <w:p>
+      <w:pPr>
+        <w:spacing w:line="384" w:lineRule="auto" w:after="120"/>
+        <w:jc w:val="both"/>
+      </w:pPr>
+      <w:r>
+        <w:rPr>
+          <w:rFonts w:ascii="Consolas" w:hAnsi="Consolas" w:eastAsia="Consolas"/>
+          <w:sz w:val="18"/>
+        </w:rPr>
+        <w:t>validate_schema(actual, expected, ...)</w:t>
+      </w:r>
+      <w:r>
+        <w:rPr>
+          <w:rFonts w:ascii="Times New Roman" w:hAnsi="Times New Roman" w:eastAsia="Batang"/>
+          <w:sz w:val="22"/>
+        </w:rPr>
+        <w:t xml:space="preserve">: </w:t>
+      </w:r>
+      <w:r>
+        <w:rPr>
+          <w:rFonts w:ascii="Consolas" w:hAnsi="Consolas" w:eastAsia="Consolas"/>
+          <w:sz w:val="18"/>
+        </w:rPr>
+        <w:t>actual</w:t>
+      </w:r>
+      <w:r>
+        <w:rPr>
+          <w:rFonts w:ascii="Times New Roman" w:hAnsi="Times New Roman" w:eastAsia="Batang"/>
+          <w:sz w:val="22"/>
+        </w:rPr>
+        <w:t xml:space="preserve"> first, </w:t>
+      </w:r>
+      <w:r>
+        <w:rPr>
+          <w:rFonts w:ascii="Consolas" w:hAnsi="Consolas" w:eastAsia="Consolas"/>
+          <w:sz w:val="18"/>
+        </w:rPr>
+        <w:t>expected</w:t>
+      </w:r>
+      <w:r>
+        <w:rPr>
+          <w:rFonts w:ascii="Times New Roman" w:hAnsi="Times New Roman" w:eastAsia="Batang"/>
+          <w:sz w:val="22"/>
+        </w:rPr>
+        <w:t xml:space="preserve"> second, matching the reading "validate actual [against] expected". Swapping the two arguments still produces a structurally meaningful diff (Rust and Python both accept it without error), but </w:t>
+      </w:r>
+      <w:r>
+        <w:rPr>
+          <w:rFonts w:ascii="Consolas" w:hAnsi="Consolas" w:eastAsia="Consolas"/>
+          <w:sz w:val="18"/>
+        </w:rPr>
+        <w:t>.missing</w:t>
+      </w:r>
+      <w:r>
+        <w:rPr>
+          <w:rFonts w:ascii="Times New Roman" w:hAnsi="Times New Roman" w:eastAsia="Batang"/>
+          <w:sz w:val="22"/>
+        </w:rPr>
+        <w:t>/</w:t>
+      </w:r>
+      <w:r>
+        <w:rPr>
+          <w:rFonts w:ascii="Consolas" w:hAnsi="Consolas" w:eastAsia="Consolas"/>
+          <w:sz w:val="18"/>
+        </w:rPr>
+        <w:t>.unexpected</w:t>
+      </w:r>
+      <w:r>
+        <w:rPr>
+          <w:rFonts w:ascii="Times New Roman" w:hAnsi="Times New Roman" w:eastAsia="Batang"/>
+          <w:sz w:val="22"/>
+        </w:rPr>
+        <w:t xml:space="preserve"> and the direction of </w:t>
+      </w:r>
+      <w:r>
+        <w:rPr>
+          <w:rFonts w:ascii="Consolas" w:hAnsi="Consolas" w:eastAsia="Consolas"/>
+          <w:sz w:val="18"/>
+        </w:rPr>
+        <w:t>.nullability</w:t>
+      </w:r>
+      <w:r>
+        <w:rPr>
+          <w:rFonts w:ascii="Times New Roman" w:hAnsi="Times New Roman" w:eastAsia="Batang"/>
+          <w:sz w:val="22"/>
+        </w:rPr>
+        <w:t>'s tightening check flip meaning, so a swapped call can silently validate the wrong thing rather than fail loudly.</w:t>
       </w:r>
     </w:p>
     <w:p>
@@ -3083,7 +4333,51 @@
           <w:color w:val="000000"/>
           <w:sz w:val="24"/>
         </w:rPr>
-        <w:t>3. Calling from Rust</w:t>
+        <w:t>3. Validating a batch before processing it</w:t>
+      </w:r>
+    </w:p>
+    <w:p>
+      <w:pPr>
+        <w:spacing w:line="240" w:lineRule="auto" w:before="120" w:after="120"/>
+        <w:ind w:left="454"/>
+      </w:pPr>
+      <w:r>
+        <w:rPr>
+          <w:rFonts w:ascii="Consolas" w:hAnsi="Consolas" w:eastAsia="Consolas"/>
+          <w:sz w:val="18"/>
+        </w:rPr>
+        <w:t>expected_schema = pa.schema([</w:t>
+        <w:br/>
+        <w:t xml:space="preserve">    pa.field("id", pa.int64(), nullable=False),</w:t>
+        <w:br/>
+        <w:t xml:space="preserve">    pa.field("email", pa.string(), nullable=True),</w:t>
+        <w:br/>
+        <w:t>])</w:t>
+        <w:br/>
+        <w:br/>
+        <w:t>diff = witchhat.validate_schema(incoming_batch.schema, expected_schema)</w:t>
+        <w:br/>
+        <w:t>if diff.is_breaking():</w:t>
+        <w:br/>
+        <w:t xml:space="preserve">    raise ValueError(f"incoming batch does not match expected schema: {diff!r}")</w:t>
+        <w:br/>
+        <w:t>if not diff.is_empty():</w:t>
+        <w:br/>
+        <w:t xml:space="preserve">    logging.warning("additive schema change: %r", diff.unexpected)</w:t>
+      </w:r>
+    </w:p>
+    <w:p>
+      <w:pPr>
+        <w:pStyle w:val="Heading2"/>
+      </w:pPr>
+      <w:r>
+        <w:rPr>
+          <w:rFonts w:ascii="Times New Roman" w:hAnsi="Times New Roman" w:eastAsia="Batang"/>
+          <w:b/>
+          <w:color w:val="000000"/>
+          <w:sz w:val="24"/>
+        </w:rPr>
+        <w:t>4. Calling from Rust</w:t>
       </w:r>
     </w:p>
     <w:p>
@@ -3430,6 +4724,64 @@
                 <w:sz w:val="18"/>
               </w:rPr>
               <w:t>version="v1"</w:t>
+            </w:r>
+          </w:p>
+        </w:tc>
+      </w:tr>
+      <w:tr>
+        <w:tc>
+          <w:tcPr>
+            <w:tcW w:type="dxa" w:w="3135"/>
+          </w:tcPr>
+          <w:p>
+            <w:r>
+              <w:rPr>
+                <w:rFonts w:ascii="Consolas" w:hAnsi="Consolas" w:eastAsia="Consolas"/>
+                <w:sz w:val="18"/>
+              </w:rPr>
+              <w:t>validate_schema</w:t>
+            </w:r>
+          </w:p>
+        </w:tc>
+        <w:tc>
+          <w:tcPr>
+            <w:tcW w:type="dxa" w:w="3135"/>
+          </w:tcPr>
+          <w:p>
+            <w:r>
+              <w:rPr>
+                <w:rFonts w:ascii="Consolas" w:hAnsi="Consolas" w:eastAsia="Consolas"/>
+                <w:sz w:val="18"/>
+              </w:rPr>
+              <w:t>actual</w:t>
+            </w:r>
+            <w:r>
+              <w:rPr>
+                <w:rFonts w:ascii="Times New Roman" w:hAnsi="Times New Roman" w:eastAsia="Batang"/>
+                <w:sz w:val="22"/>
+              </w:rPr>
+              <w:t xml:space="preserve">, </w:t>
+            </w:r>
+            <w:r>
+              <w:rPr>
+                <w:rFonts w:ascii="Consolas" w:hAnsi="Consolas" w:eastAsia="Consolas"/>
+                <w:sz w:val="18"/>
+              </w:rPr>
+              <w:t>expected</w:t>
+            </w:r>
+          </w:p>
+        </w:tc>
+        <w:tc>
+          <w:tcPr>
+            <w:tcW w:type="dxa" w:w="3135"/>
+          </w:tcPr>
+          <w:p>
+            <w:r>
+              <w:rPr>
+                <w:rFonts w:ascii="Consolas" w:hAnsi="Consolas" w:eastAsia="Consolas"/>
+                <w:sz w:val="18"/>
+              </w:rPr>
+              <w:t>allow_numeric_widening=False</w:t>
             </w:r>
           </w:p>
         </w:tc>

</xml_diff>

<commit_message>
Commit for changes and logging beyond metrics
</commit_message>
<xml_diff>
--- a/docs/api.docx
+++ b/docs/api.docx
@@ -49,7 +49,7 @@
           <w:rFonts w:ascii="Times New Roman" w:hAnsi="Times New Roman" w:eastAsia="Batang"/>
           <w:sz w:val="22"/>
         </w:rPr>
-        <w:t xml:space="preserve"> Describes the surface as built: composite hashing, schema validation, JSON normalization, regex cleanup, output-equivalence testing, deduplication, join, aggregate, schema/CPU introspection, and the </w:t>
+        <w:t xml:space="preserve"> Describes the surface as built: composite hashing, schema validation, JSON normalization, regex cleanup, output-equivalence testing, deduplication, join, aggregate, schema/CPU introspection, the </w:t>
       </w:r>
       <w:r>
         <w:rPr>
@@ -63,7 +63,7 @@
           <w:rFonts w:ascii="Times New Roman" w:hAnsi="Times New Roman" w:eastAsia="Batang"/>
           <w:sz w:val="22"/>
         </w:rPr>
-        <w:t xml:space="preserve"> Databricks/Spark integration layer. </w:t>
+        <w:t xml:space="preserve"> Databricks/Spark integration layer, and optional JSON metric logging. </w:t>
       </w:r>
       <w:r>
         <w:rPr>
@@ -136,7 +136,7 @@
           <w:rFonts w:ascii="Times New Roman" w:hAnsi="Times New Roman" w:eastAsia="Batang"/>
           <w:sz w:val="22"/>
         </w:rPr>
-        <w:t xml:space="preserve"> 1.4 </w:t>
+        <w:t xml:space="preserve"> 1.5 </w:t>
       </w:r>
       <w:r>
         <w:rPr>
@@ -790,7 +790,21 @@
           <w:rFonts w:ascii="Times New Roman" w:hAnsi="Times New Roman" w:eastAsia="Batang"/>
           <w:sz w:val="22"/>
         </w:rPr>
-        <w:t>IV. Rust Surface</w:t>
+        <w:t>IV. Metric Logging (</w:t>
+      </w:r>
+      <w:r>
+        <w:rPr>
+          <w:rFonts w:ascii="Consolas" w:hAnsi="Consolas" w:eastAsia="Consolas"/>
+          <w:sz w:val="18"/>
+        </w:rPr>
+        <w:t>witchhat.metrics</w:t>
+      </w:r>
+      <w:r>
+        <w:rPr>
+          <w:rFonts w:ascii="Times New Roman" w:hAnsi="Times New Roman" w:eastAsia="Batang"/>
+          <w:sz w:val="22"/>
+        </w:rPr>
+        <w:t>)</w:t>
       </w:r>
     </w:p>
     <w:p>
@@ -803,7 +817,42 @@
           <w:rFonts w:ascii="Times New Roman" w:hAnsi="Times New Roman" w:eastAsia="Batang"/>
           <w:sz w:val="22"/>
         </w:rPr>
-        <w:t>1. Entry points</w:t>
+        <w:t xml:space="preserve">1. </w:t>
+      </w:r>
+      <w:r>
+        <w:rPr>
+          <w:rFonts w:ascii="Consolas" w:hAnsi="Consolas" w:eastAsia="Consolas"/>
+          <w:sz w:val="18"/>
+        </w:rPr>
+        <w:t>enable</w:t>
+      </w:r>
+      <w:r>
+        <w:rPr>
+          <w:rFonts w:ascii="Times New Roman" w:hAnsi="Times New Roman" w:eastAsia="Batang"/>
+          <w:sz w:val="22"/>
+        </w:rPr>
+        <w:t xml:space="preserve">, </w:t>
+      </w:r>
+      <w:r>
+        <w:rPr>
+          <w:rFonts w:ascii="Consolas" w:hAnsi="Consolas" w:eastAsia="Consolas"/>
+          <w:sz w:val="18"/>
+        </w:rPr>
+        <w:t>disable</w:t>
+      </w:r>
+      <w:r>
+        <w:rPr>
+          <w:rFonts w:ascii="Times New Roman" w:hAnsi="Times New Roman" w:eastAsia="Batang"/>
+          <w:sz w:val="22"/>
+        </w:rPr>
+        <w:t xml:space="preserve">, </w:t>
+      </w:r>
+      <w:r>
+        <w:rPr>
+          <w:rFonts w:ascii="Consolas" w:hAnsi="Consolas" w:eastAsia="Consolas"/>
+          <w:sz w:val="18"/>
+        </w:rPr>
+        <w:t>is_enabled</w:t>
       </w:r>
     </w:p>
     <w:p>
@@ -816,7 +865,7 @@
           <w:rFonts w:ascii="Times New Roman" w:hAnsi="Times New Roman" w:eastAsia="Batang"/>
           <w:sz w:val="22"/>
         </w:rPr>
-        <w:t>2. Version enums</w:t>
+        <w:t>2. Event shape</w:t>
       </w:r>
     </w:p>
     <w:p>
@@ -829,7 +878,28 @@
           <w:rFonts w:ascii="Times New Roman" w:hAnsi="Times New Roman" w:eastAsia="Batang"/>
           <w:sz w:val="22"/>
         </w:rPr>
-        <w:t>3. Module map</w:t>
+        <w:t xml:space="preserve">3. </w:t>
+      </w:r>
+      <w:r>
+        <w:rPr>
+          <w:rFonts w:ascii="Consolas" w:hAnsi="Consolas" w:eastAsia="Consolas"/>
+          <w:sz w:val="18"/>
+        </w:rPr>
+        <w:t>row_count</w:t>
+      </w:r>
+      <w:r>
+        <w:rPr>
+          <w:rFonts w:ascii="Times New Roman" w:hAnsi="Times New Roman" w:eastAsia="Batang"/>
+          <w:sz w:val="22"/>
+        </w:rPr>
+        <w:t xml:space="preserve">, </w:t>
+      </w:r>
+      <w:r>
+        <w:rPr>
+          <w:rFonts w:ascii="Consolas" w:hAnsi="Consolas" w:eastAsia="Consolas"/>
+          <w:sz w:val="18"/>
+        </w:rPr>
+        <w:t>measure</w:t>
       </w:r>
     </w:p>
     <w:p>
@@ -842,7 +912,7 @@
           <w:rFonts w:ascii="Times New Roman" w:hAnsi="Times New Roman" w:eastAsia="Batang"/>
           <w:sz w:val="22"/>
         </w:rPr>
-        <w:t>4. Error type</w:t>
+        <w:t>V. Rust Surface</w:t>
       </w:r>
     </w:p>
     <w:p>
@@ -855,7 +925,7 @@
           <w:rFonts w:ascii="Times New Roman" w:hAnsi="Times New Roman" w:eastAsia="Batang"/>
           <w:sz w:val="22"/>
         </w:rPr>
-        <w:t>V. Semantics Callers Must Know</w:t>
+        <w:t>1. Entry points</w:t>
       </w:r>
     </w:p>
     <w:p>
@@ -868,7 +938,7 @@
           <w:rFonts w:ascii="Times New Roman" w:hAnsi="Times New Roman" w:eastAsia="Batang"/>
           <w:sz w:val="22"/>
         </w:rPr>
-        <w:t>1. Column order</w:t>
+        <w:t>2. Version enums</w:t>
       </w:r>
     </w:p>
     <w:p>
@@ -881,7 +951,7 @@
           <w:rFonts w:ascii="Times New Roman" w:hAnsi="Times New Roman" w:eastAsia="Batang"/>
           <w:sz w:val="22"/>
         </w:rPr>
-        <w:t>2. Null and float equality</w:t>
+        <w:t>3. Module map</w:t>
       </w:r>
     </w:p>
     <w:p>
@@ -894,7 +964,7 @@
           <w:rFonts w:ascii="Times New Roman" w:hAnsi="Times New Roman" w:eastAsia="Batang"/>
           <w:sz w:val="22"/>
         </w:rPr>
-        <w:t>3. Version pinning</w:t>
+        <w:t>4. Error type</w:t>
       </w:r>
     </w:p>
     <w:p>
@@ -907,7 +977,7 @@
           <w:rFonts w:ascii="Times New Roman" w:hAnsi="Times New Roman" w:eastAsia="Batang"/>
           <w:sz w:val="22"/>
         </w:rPr>
-        <w:t>4. What accepts non-pyarrow objects</w:t>
+        <w:t>VI. Semantics Callers Must Know</w:t>
       </w:r>
     </w:p>
     <w:p>
@@ -920,21 +990,7 @@
           <w:rFonts w:ascii="Times New Roman" w:hAnsi="Times New Roman" w:eastAsia="Batang"/>
           <w:sz w:val="22"/>
         </w:rPr>
-        <w:t xml:space="preserve">5. </w:t>
-      </w:r>
-      <w:r>
-        <w:rPr>
-          <w:rFonts w:ascii="Consolas" w:hAnsi="Consolas" w:eastAsia="Consolas"/>
-          <w:sz w:val="18"/>
-        </w:rPr>
-        <w:t>validate_schema</w:t>
-      </w:r>
-      <w:r>
-        <w:rPr>
-          <w:rFonts w:ascii="Times New Roman" w:hAnsi="Times New Roman" w:eastAsia="Batang"/>
-          <w:sz w:val="22"/>
-        </w:rPr>
-        <w:t xml:space="preserve"> argument order</w:t>
+        <w:t>1. Column order</w:t>
       </w:r>
     </w:p>
     <w:p>
@@ -947,21 +1003,7 @@
           <w:rFonts w:ascii="Times New Roman" w:hAnsi="Times New Roman" w:eastAsia="Batang"/>
           <w:sz w:val="22"/>
         </w:rPr>
-        <w:t xml:space="preserve">6. </w:t>
-      </w:r>
-      <w:r>
-        <w:rPr>
-          <w:rFonts w:ascii="Consolas" w:hAnsi="Consolas" w:eastAsia="Consolas"/>
-          <w:sz w:val="18"/>
-        </w:rPr>
-        <w:t>check_equivalence</w:t>
-      </w:r>
-      <w:r>
-        <w:rPr>
-          <w:rFonts w:ascii="Times New Roman" w:hAnsi="Times New Roman" w:eastAsia="Batang"/>
-          <w:sz w:val="22"/>
-        </w:rPr>
-        <w:t xml:space="preserve"> is stricter than "not breaking"</w:t>
+        <w:t>2. Null and float equality</w:t>
       </w:r>
     </w:p>
     <w:p>
@@ -974,21 +1016,7 @@
           <w:rFonts w:ascii="Times New Roman" w:hAnsi="Times New Roman" w:eastAsia="Batang"/>
           <w:sz w:val="22"/>
         </w:rPr>
-        <w:t xml:space="preserve">7. </w:t>
-      </w:r>
-      <w:r>
-        <w:rPr>
-          <w:rFonts w:ascii="Consolas" w:hAnsi="Consolas" w:eastAsia="Consolas"/>
-          <w:sz w:val="18"/>
-        </w:rPr>
-        <w:t>join</w:t>
-      </w:r>
-      <w:r>
-        <w:rPr>
-          <w:rFonts w:ascii="Times New Roman" w:hAnsi="Times New Roman" w:eastAsia="Batang"/>
-          <w:sz w:val="22"/>
-        </w:rPr>
-        <w:t xml:space="preserve"> requires exact key-type matches</w:t>
+        <w:t>3. Version pinning</w:t>
       </w:r>
     </w:p>
     <w:p>
@@ -1001,28 +1029,7 @@
           <w:rFonts w:ascii="Times New Roman" w:hAnsi="Times New Roman" w:eastAsia="Batang"/>
           <w:sz w:val="22"/>
         </w:rPr>
-        <w:t xml:space="preserve">8. </w:t>
-      </w:r>
-      <w:r>
-        <w:rPr>
-          <w:rFonts w:ascii="Consolas" w:hAnsi="Consolas" w:eastAsia="Consolas"/>
-          <w:sz w:val="18"/>
-        </w:rPr>
-        <w:t>aggregate</w:t>
-      </w:r>
-      <w:r>
-        <w:rPr>
-          <w:rFonts w:ascii="Times New Roman" w:hAnsi="Times New Roman" w:eastAsia="Batang"/>
-          <w:sz w:val="22"/>
-        </w:rPr>
-        <w:t xml:space="preserve"> is numeric-only beyond </w:t>
-      </w:r>
-      <w:r>
-        <w:rPr>
-          <w:rFonts w:ascii="Consolas" w:hAnsi="Consolas" w:eastAsia="Consolas"/>
-          <w:sz w:val="18"/>
-        </w:rPr>
-        <w:t>Count</w:t>
+        <w:t>4. What accepts non-pyarrow objects</w:t>
       </w:r>
     </w:p>
     <w:p>
@@ -1035,35 +1042,21 @@
           <w:rFonts w:ascii="Times New Roman" w:hAnsi="Times New Roman" w:eastAsia="Batang"/>
           <w:sz w:val="22"/>
         </w:rPr>
-        <w:t xml:space="preserve">9. </w:t>
-      </w:r>
-      <w:r>
-        <w:rPr>
-          <w:rFonts w:ascii="Consolas" w:hAnsi="Consolas" w:eastAsia="Consolas"/>
-          <w:sz w:val="18"/>
-        </w:rPr>
-        <w:t>witchhat.spark</w:t>
-      </w:r>
-      <w:r>
-        <w:rPr>
-          <w:rFonts w:ascii="Times New Roman" w:hAnsi="Times New Roman" w:eastAsia="Batang"/>
-          <w:sz w:val="22"/>
-        </w:rPr>
-        <w:t xml:space="preserve">'s </w:t>
-      </w:r>
-      <w:r>
-        <w:rPr>
-          <w:rFonts w:ascii="Consolas" w:hAnsi="Consolas" w:eastAsia="Consolas"/>
-          <w:sz w:val="18"/>
-        </w:rPr>
-        <w:t>repartition=True</w:t>
-      </w:r>
-      <w:r>
-        <w:rPr>
-          <w:rFonts w:ascii="Times New Roman" w:hAnsi="Times New Roman" w:eastAsia="Batang"/>
-          <w:sz w:val="22"/>
-        </w:rPr>
-        <w:t xml:space="preserve"> default</w:t>
+        <w:t xml:space="preserve">5. </w:t>
+      </w:r>
+      <w:r>
+        <w:rPr>
+          <w:rFonts w:ascii="Consolas" w:hAnsi="Consolas" w:eastAsia="Consolas"/>
+          <w:sz w:val="18"/>
+        </w:rPr>
+        <w:t>validate_schema</w:t>
+      </w:r>
+      <w:r>
+        <w:rPr>
+          <w:rFonts w:ascii="Times New Roman" w:hAnsi="Times New Roman" w:eastAsia="Batang"/>
+          <w:sz w:val="22"/>
+        </w:rPr>
+        <w:t xml:space="preserve"> argument order</w:t>
       </w:r>
     </w:p>
     <w:p>
@@ -1076,7 +1069,21 @@
           <w:rFonts w:ascii="Times New Roman" w:hAnsi="Times New Roman" w:eastAsia="Batang"/>
           <w:sz w:val="22"/>
         </w:rPr>
-        <w:t>VI. Worked Examples</w:t>
+        <w:t xml:space="preserve">6. </w:t>
+      </w:r>
+      <w:r>
+        <w:rPr>
+          <w:rFonts w:ascii="Consolas" w:hAnsi="Consolas" w:eastAsia="Consolas"/>
+          <w:sz w:val="18"/>
+        </w:rPr>
+        <w:t>check_equivalence</w:t>
+      </w:r>
+      <w:r>
+        <w:rPr>
+          <w:rFonts w:ascii="Times New Roman" w:hAnsi="Times New Roman" w:eastAsia="Batang"/>
+          <w:sz w:val="22"/>
+        </w:rPr>
+        <w:t xml:space="preserve"> is stricter than "not breaking"</w:t>
       </w:r>
     </w:p>
     <w:p>
@@ -1089,7 +1096,21 @@
           <w:rFonts w:ascii="Times New Roman" w:hAnsi="Times New Roman" w:eastAsia="Batang"/>
           <w:sz w:val="22"/>
         </w:rPr>
-        <w:t>1. Deduplicating rows</w:t>
+        <w:t xml:space="preserve">7. </w:t>
+      </w:r>
+      <w:r>
+        <w:rPr>
+          <w:rFonts w:ascii="Consolas" w:hAnsi="Consolas" w:eastAsia="Consolas"/>
+          <w:sz w:val="18"/>
+        </w:rPr>
+        <w:t>join</w:t>
+      </w:r>
+      <w:r>
+        <w:rPr>
+          <w:rFonts w:ascii="Times New Roman" w:hAnsi="Times New Roman" w:eastAsia="Batang"/>
+          <w:sz w:val="22"/>
+        </w:rPr>
+        <w:t xml:space="preserve"> requires exact key-type matches</w:t>
       </w:r>
     </w:p>
     <w:p>
@@ -1102,7 +1123,28 @@
           <w:rFonts w:ascii="Times New Roman" w:hAnsi="Times New Roman" w:eastAsia="Batang"/>
           <w:sz w:val="22"/>
         </w:rPr>
-        <w:t>2. Checking output against Spark</w:t>
+        <w:t xml:space="preserve">8. </w:t>
+      </w:r>
+      <w:r>
+        <w:rPr>
+          <w:rFonts w:ascii="Consolas" w:hAnsi="Consolas" w:eastAsia="Consolas"/>
+          <w:sz w:val="18"/>
+        </w:rPr>
+        <w:t>aggregate</w:t>
+      </w:r>
+      <w:r>
+        <w:rPr>
+          <w:rFonts w:ascii="Times New Roman" w:hAnsi="Times New Roman" w:eastAsia="Batang"/>
+          <w:sz w:val="22"/>
+        </w:rPr>
+        <w:t xml:space="preserve"> is numeric-only beyond </w:t>
+      </w:r>
+      <w:r>
+        <w:rPr>
+          <w:rFonts w:ascii="Consolas" w:hAnsi="Consolas" w:eastAsia="Consolas"/>
+          <w:sz w:val="18"/>
+        </w:rPr>
+        <w:t>Count</w:t>
       </w:r>
     </w:p>
     <w:p>
@@ -1115,7 +1157,35 @@
           <w:rFonts w:ascii="Times New Roman" w:hAnsi="Times New Roman" w:eastAsia="Batang"/>
           <w:sz w:val="22"/>
         </w:rPr>
-        <w:t>3. Validating a batch before processing it</w:t>
+        <w:t xml:space="preserve">9. </w:t>
+      </w:r>
+      <w:r>
+        <w:rPr>
+          <w:rFonts w:ascii="Consolas" w:hAnsi="Consolas" w:eastAsia="Consolas"/>
+          <w:sz w:val="18"/>
+        </w:rPr>
+        <w:t>witchhat.spark</w:t>
+      </w:r>
+      <w:r>
+        <w:rPr>
+          <w:rFonts w:ascii="Times New Roman" w:hAnsi="Times New Roman" w:eastAsia="Batang"/>
+          <w:sz w:val="22"/>
+        </w:rPr>
+        <w:t xml:space="preserve">'s </w:t>
+      </w:r>
+      <w:r>
+        <w:rPr>
+          <w:rFonts w:ascii="Consolas" w:hAnsi="Consolas" w:eastAsia="Consolas"/>
+          <w:sz w:val="18"/>
+        </w:rPr>
+        <w:t>repartition=True</w:t>
+      </w:r>
+      <w:r>
+        <w:rPr>
+          <w:rFonts w:ascii="Times New Roman" w:hAnsi="Times New Roman" w:eastAsia="Batang"/>
+          <w:sz w:val="22"/>
+        </w:rPr>
+        <w:t xml:space="preserve"> default</w:t>
       </w:r>
     </w:p>
     <w:p>
@@ -1128,7 +1198,7 @@
           <w:rFonts w:ascii="Times New Roman" w:hAnsi="Times New Roman" w:eastAsia="Batang"/>
           <w:sz w:val="22"/>
         </w:rPr>
-        <w:t>4. Normalizing JSON, then cleaning a column</w:t>
+        <w:t>VII. Worked Examples</w:t>
       </w:r>
     </w:p>
     <w:p>
@@ -1141,7 +1211,7 @@
           <w:rFonts w:ascii="Times New Roman" w:hAnsi="Times New Roman" w:eastAsia="Batang"/>
           <w:sz w:val="22"/>
         </w:rPr>
-        <w:t>5. Joining and aggregating</w:t>
+        <w:t>1. Deduplicating rows</w:t>
       </w:r>
     </w:p>
     <w:p>
@@ -1154,14 +1224,7 @@
           <w:rFonts w:ascii="Times New Roman" w:hAnsi="Times New Roman" w:eastAsia="Batang"/>
           <w:sz w:val="22"/>
         </w:rPr>
-        <w:t xml:space="preserve">6. A Databricks notebook pipeline with </w:t>
-      </w:r>
-      <w:r>
-        <w:rPr>
-          <w:rFonts w:ascii="Consolas" w:hAnsi="Consolas" w:eastAsia="Consolas"/>
-          <w:sz w:val="18"/>
-        </w:rPr>
-        <w:t>witchhat.spark</w:t>
+        <w:t>2. Checking output against Spark</w:t>
       </w:r>
     </w:p>
     <w:p>
@@ -1174,7 +1237,7 @@
           <w:rFonts w:ascii="Times New Roman" w:hAnsi="Times New Roman" w:eastAsia="Batang"/>
           <w:sz w:val="22"/>
         </w:rPr>
-        <w:t>7. Calling from Rust</w:t>
+        <w:t>3. Validating a batch before processing it</w:t>
       </w:r>
     </w:p>
     <w:p>
@@ -1187,7 +1250,7 @@
           <w:rFonts w:ascii="Times New Roman" w:hAnsi="Times New Roman" w:eastAsia="Batang"/>
           <w:sz w:val="22"/>
         </w:rPr>
-        <w:t>References</w:t>
+        <w:t>4. Normalizing JSON, then cleaning a column</w:t>
       </w:r>
     </w:p>
     <w:p>
@@ -1200,21 +1263,7 @@
           <w:rFonts w:ascii="Times New Roman" w:hAnsi="Times New Roman" w:eastAsia="Batang"/>
           <w:sz w:val="22"/>
         </w:rPr>
-        <w:t>Appendix A. Parameter quick reference</w:t>
-      </w:r>
-    </w:p>
-    <w:p>
-      <w:pPr>
-        <w:pStyle w:val="Heading2"/>
-      </w:pPr>
-      <w:r>
-        <w:rPr>
-          <w:rFonts w:ascii="Times New Roman" w:hAnsi="Times New Roman" w:eastAsia="Batang"/>
-          <w:b/>
-          <w:color w:val="000000"/>
-          <w:sz w:val="24"/>
-        </w:rPr>
-        <w:t>List of Tables</w:t>
+        <w:t>5. Joining and aggregating</w:t>
       </w:r>
     </w:p>
     <w:p>
@@ -1224,24 +1273,17 @@
       </w:pPr>
       <w:r>
         <w:rPr>
-          <w:rFonts w:ascii="Consolas" w:hAnsi="Consolas" w:eastAsia="Consolas"/>
-          <w:sz w:val="18"/>
-        </w:rPr>
-        <w:t>&lt;Table 2-1&gt;</w:t>
-      </w:r>
-      <w:r>
-        <w:rPr>
-          <w:rFonts w:ascii="Times New Roman" w:hAnsi="Times New Roman" w:eastAsia="Batang"/>
-          <w:sz w:val="22"/>
-        </w:rPr>
-        <w:t xml:space="preserve"> Parameters of </w:t>
-      </w:r>
-      <w:r>
-        <w:rPr>
-          <w:rFonts w:ascii="Consolas" w:hAnsi="Consolas" w:eastAsia="Consolas"/>
-          <w:sz w:val="18"/>
-        </w:rPr>
-        <w:t>hash_rows</w:t>
+          <w:rFonts w:ascii="Times New Roman" w:hAnsi="Times New Roman" w:eastAsia="Batang"/>
+          <w:sz w:val="22"/>
+        </w:rPr>
+        <w:t xml:space="preserve">6. A Databricks notebook pipeline with </w:t>
+      </w:r>
+      <w:r>
+        <w:rPr>
+          <w:rFonts w:ascii="Consolas" w:hAnsi="Consolas" w:eastAsia="Consolas"/>
+          <w:sz w:val="18"/>
+        </w:rPr>
+        <w:t>witchhat.spark</w:t>
       </w:r>
     </w:p>
     <w:p>
@@ -1251,17 +1293,10 @@
       </w:pPr>
       <w:r>
         <w:rPr>
-          <w:rFonts w:ascii="Consolas" w:hAnsi="Consolas" w:eastAsia="Consolas"/>
-          <w:sz w:val="18"/>
-        </w:rPr>
-        <w:t>&lt;Table 2-2&gt;</w:t>
-      </w:r>
-      <w:r>
-        <w:rPr>
-          <w:rFonts w:ascii="Times New Roman" w:hAnsi="Times New Roman" w:eastAsia="Batang"/>
-          <w:sz w:val="22"/>
-        </w:rPr>
-        <w:t xml:space="preserve"> Exceptions raised by the Python surface</w:t>
+          <w:rFonts w:ascii="Times New Roman" w:hAnsi="Times New Roman" w:eastAsia="Batang"/>
+          <w:sz w:val="22"/>
+        </w:rPr>
+        <w:t>7. Measuring latency and throughput</w:t>
       </w:r>
     </w:p>
     <w:p>
@@ -1271,24 +1306,10 @@
       </w:pPr>
       <w:r>
         <w:rPr>
-          <w:rFonts w:ascii="Consolas" w:hAnsi="Consolas" w:eastAsia="Consolas"/>
-          <w:sz w:val="18"/>
-        </w:rPr>
-        <w:t>&lt;Table 2-3&gt;</w:t>
-      </w:r>
-      <w:r>
-        <w:rPr>
-          <w:rFonts w:ascii="Times New Roman" w:hAnsi="Times New Roman" w:eastAsia="Batang"/>
-          <w:sz w:val="22"/>
-        </w:rPr>
-        <w:t xml:space="preserve"> Fields and methods of </w:t>
-      </w:r>
-      <w:r>
-        <w:rPr>
-          <w:rFonts w:ascii="Consolas" w:hAnsi="Consolas" w:eastAsia="Consolas"/>
-          <w:sz w:val="18"/>
-        </w:rPr>
-        <w:t>SchemaDiff</w:t>
+          <w:rFonts w:ascii="Times New Roman" w:hAnsi="Times New Roman" w:eastAsia="Batang"/>
+          <w:sz w:val="22"/>
+        </w:rPr>
+        <w:t>8. Calling from Rust</w:t>
       </w:r>
     </w:p>
     <w:p>
@@ -1298,24 +1319,10 @@
       </w:pPr>
       <w:r>
         <w:rPr>
-          <w:rFonts w:ascii="Consolas" w:hAnsi="Consolas" w:eastAsia="Consolas"/>
-          <w:sz w:val="18"/>
-        </w:rPr>
-        <w:t>&lt;Table 2-4&gt;</w:t>
-      </w:r>
-      <w:r>
-        <w:rPr>
-          <w:rFonts w:ascii="Times New Roman" w:hAnsi="Times New Roman" w:eastAsia="Batang"/>
-          <w:sz w:val="22"/>
-        </w:rPr>
-        <w:t xml:space="preserve"> Fields of </w:t>
-      </w:r>
-      <w:r>
-        <w:rPr>
-          <w:rFonts w:ascii="Consolas" w:hAnsi="Consolas" w:eastAsia="Consolas"/>
-          <w:sz w:val="18"/>
-        </w:rPr>
-        <w:t>NormalizeStats</w:t>
+          <w:rFonts w:ascii="Times New Roman" w:hAnsi="Times New Roman" w:eastAsia="Batang"/>
+          <w:sz w:val="22"/>
+        </w:rPr>
+        <w:t>References</w:t>
       </w:r>
     </w:p>
     <w:p>
@@ -1325,17 +1332,24 @@
       </w:pPr>
       <w:r>
         <w:rPr>
-          <w:rFonts w:ascii="Consolas" w:hAnsi="Consolas" w:eastAsia="Consolas"/>
-          <w:sz w:val="18"/>
-        </w:rPr>
-        <w:t>&lt;Table 2-5&gt;</w:t>
-      </w:r>
-      <w:r>
-        <w:rPr>
-          <w:rFonts w:ascii="Times New Roman" w:hAnsi="Times New Roman" w:eastAsia="Batang"/>
-          <w:sz w:val="22"/>
-        </w:rPr>
-        <w:t xml:space="preserve"> Built-in cleanup presets</w:t>
+          <w:rFonts w:ascii="Times New Roman" w:hAnsi="Times New Roman" w:eastAsia="Batang"/>
+          <w:sz w:val="22"/>
+        </w:rPr>
+        <w:t>Appendix A. Parameter quick reference</w:t>
+      </w:r>
+    </w:p>
+    <w:p>
+      <w:pPr>
+        <w:pStyle w:val="Heading2"/>
+      </w:pPr>
+      <w:r>
+        <w:rPr>
+          <w:rFonts w:ascii="Times New Roman" w:hAnsi="Times New Roman" w:eastAsia="Batang"/>
+          <w:b/>
+          <w:color w:val="000000"/>
+          <w:sz w:val="24"/>
+        </w:rPr>
+        <w:t>List of Tables</w:t>
       </w:r>
     </w:p>
     <w:p>
@@ -1348,21 +1362,21 @@
           <w:rFonts w:ascii="Consolas" w:hAnsi="Consolas" w:eastAsia="Consolas"/>
           <w:sz w:val="18"/>
         </w:rPr>
-        <w:t>&lt;Table 2-6&gt;</w:t>
-      </w:r>
-      <w:r>
-        <w:rPr>
-          <w:rFonts w:ascii="Times New Roman" w:hAnsi="Times New Roman" w:eastAsia="Batang"/>
-          <w:sz w:val="22"/>
-        </w:rPr>
-        <w:t xml:space="preserve"> Fields and methods of </w:t>
-      </w:r>
-      <w:r>
-        <w:rPr>
-          <w:rFonts w:ascii="Consolas" w:hAnsi="Consolas" w:eastAsia="Consolas"/>
-          <w:sz w:val="18"/>
-        </w:rPr>
-        <w:t>EquivalenceReport</w:t>
+        <w:t>&lt;Table 2-1&gt;</w:t>
+      </w:r>
+      <w:r>
+        <w:rPr>
+          <w:rFonts w:ascii="Times New Roman" w:hAnsi="Times New Roman" w:eastAsia="Batang"/>
+          <w:sz w:val="22"/>
+        </w:rPr>
+        <w:t xml:space="preserve"> Parameters of </w:t>
+      </w:r>
+      <w:r>
+        <w:rPr>
+          <w:rFonts w:ascii="Consolas" w:hAnsi="Consolas" w:eastAsia="Consolas"/>
+          <w:sz w:val="18"/>
+        </w:rPr>
+        <w:t>hash_rows</w:t>
       </w:r>
     </w:p>
     <w:p>
@@ -1375,21 +1389,14 @@
           <w:rFonts w:ascii="Consolas" w:hAnsi="Consolas" w:eastAsia="Consolas"/>
           <w:sz w:val="18"/>
         </w:rPr>
-        <w:t>&lt;Table 2-7&gt;</w:t>
-      </w:r>
-      <w:r>
-        <w:rPr>
-          <w:rFonts w:ascii="Times New Roman" w:hAnsi="Times New Roman" w:eastAsia="Batang"/>
-          <w:sz w:val="22"/>
-        </w:rPr>
-        <w:t xml:space="preserve"> Aggregate functions accepted by </w:t>
-      </w:r>
-      <w:r>
-        <w:rPr>
-          <w:rFonts w:ascii="Consolas" w:hAnsi="Consolas" w:eastAsia="Consolas"/>
-          <w:sz w:val="18"/>
-        </w:rPr>
-        <w:t>aggregate</w:t>
+        <w:t>&lt;Table 2-2&gt;</w:t>
+      </w:r>
+      <w:r>
+        <w:rPr>
+          <w:rFonts w:ascii="Times New Roman" w:hAnsi="Times New Roman" w:eastAsia="Batang"/>
+          <w:sz w:val="22"/>
+        </w:rPr>
+        <w:t xml:space="preserve"> Exceptions raised by the Python surface</w:t>
       </w:r>
     </w:p>
     <w:p>
@@ -1402,28 +1409,21 @@
           <w:rFonts w:ascii="Consolas" w:hAnsi="Consolas" w:eastAsia="Consolas"/>
           <w:sz w:val="18"/>
         </w:rPr>
-        <w:t>&lt;Table 3-1&gt;</w:t>
-      </w:r>
-      <w:r>
-        <w:rPr>
-          <w:rFonts w:ascii="Times New Roman" w:hAnsi="Times New Roman" w:eastAsia="Batang"/>
-          <w:sz w:val="22"/>
-        </w:rPr>
-        <w:t xml:space="preserve"> </w:t>
-      </w:r>
-      <w:r>
-        <w:rPr>
-          <w:rFonts w:ascii="Consolas" w:hAnsi="Consolas" w:eastAsia="Consolas"/>
-          <w:sz w:val="18"/>
-        </w:rPr>
-        <w:t>witchhat.spark</w:t>
-      </w:r>
-      <w:r>
-        <w:rPr>
-          <w:rFonts w:ascii="Times New Roman" w:hAnsi="Times New Roman" w:eastAsia="Batang"/>
-          <w:sz w:val="22"/>
-        </w:rPr>
-        <w:t xml:space="preserve"> functions</w:t>
+        <w:t>&lt;Table 2-3&gt;</w:t>
+      </w:r>
+      <w:r>
+        <w:rPr>
+          <w:rFonts w:ascii="Times New Roman" w:hAnsi="Times New Roman" w:eastAsia="Batang"/>
+          <w:sz w:val="22"/>
+        </w:rPr>
+        <w:t xml:space="preserve"> Fields and methods of </w:t>
+      </w:r>
+      <w:r>
+        <w:rPr>
+          <w:rFonts w:ascii="Consolas" w:hAnsi="Consolas" w:eastAsia="Consolas"/>
+          <w:sz w:val="18"/>
+        </w:rPr>
+        <w:t>SchemaDiff</w:t>
       </w:r>
     </w:p>
     <w:p>
@@ -1436,7 +1436,162 @@
           <w:rFonts w:ascii="Consolas" w:hAnsi="Consolas" w:eastAsia="Consolas"/>
           <w:sz w:val="18"/>
         </w:rPr>
+        <w:t>&lt;Table 2-4&gt;</w:t>
+      </w:r>
+      <w:r>
+        <w:rPr>
+          <w:rFonts w:ascii="Times New Roman" w:hAnsi="Times New Roman" w:eastAsia="Batang"/>
+          <w:sz w:val="22"/>
+        </w:rPr>
+        <w:t xml:space="preserve"> Fields of </w:t>
+      </w:r>
+      <w:r>
+        <w:rPr>
+          <w:rFonts w:ascii="Consolas" w:hAnsi="Consolas" w:eastAsia="Consolas"/>
+          <w:sz w:val="18"/>
+        </w:rPr>
+        <w:t>NormalizeStats</w:t>
+      </w:r>
+    </w:p>
+    <w:p>
+      <w:pPr>
+        <w:pStyle w:val="ListBullet"/>
+        <w:spacing w:line="384" w:lineRule="auto" w:after="120"/>
+      </w:pPr>
+      <w:r>
+        <w:rPr>
+          <w:rFonts w:ascii="Consolas" w:hAnsi="Consolas" w:eastAsia="Consolas"/>
+          <w:sz w:val="18"/>
+        </w:rPr>
+        <w:t>&lt;Table 2-5&gt;</w:t>
+      </w:r>
+      <w:r>
+        <w:rPr>
+          <w:rFonts w:ascii="Times New Roman" w:hAnsi="Times New Roman" w:eastAsia="Batang"/>
+          <w:sz w:val="22"/>
+        </w:rPr>
+        <w:t xml:space="preserve"> Built-in cleanup presets</w:t>
+      </w:r>
+    </w:p>
+    <w:p>
+      <w:pPr>
+        <w:pStyle w:val="ListBullet"/>
+        <w:spacing w:line="384" w:lineRule="auto" w:after="120"/>
+      </w:pPr>
+      <w:r>
+        <w:rPr>
+          <w:rFonts w:ascii="Consolas" w:hAnsi="Consolas" w:eastAsia="Consolas"/>
+          <w:sz w:val="18"/>
+        </w:rPr>
+        <w:t>&lt;Table 2-6&gt;</w:t>
+      </w:r>
+      <w:r>
+        <w:rPr>
+          <w:rFonts w:ascii="Times New Roman" w:hAnsi="Times New Roman" w:eastAsia="Batang"/>
+          <w:sz w:val="22"/>
+        </w:rPr>
+        <w:t xml:space="preserve"> Fields and methods of </w:t>
+      </w:r>
+      <w:r>
+        <w:rPr>
+          <w:rFonts w:ascii="Consolas" w:hAnsi="Consolas" w:eastAsia="Consolas"/>
+          <w:sz w:val="18"/>
+        </w:rPr>
+        <w:t>EquivalenceReport</w:t>
+      </w:r>
+    </w:p>
+    <w:p>
+      <w:pPr>
+        <w:pStyle w:val="ListBullet"/>
+        <w:spacing w:line="384" w:lineRule="auto" w:after="120"/>
+      </w:pPr>
+      <w:r>
+        <w:rPr>
+          <w:rFonts w:ascii="Consolas" w:hAnsi="Consolas" w:eastAsia="Consolas"/>
+          <w:sz w:val="18"/>
+        </w:rPr>
+        <w:t>&lt;Table 2-7&gt;</w:t>
+      </w:r>
+      <w:r>
+        <w:rPr>
+          <w:rFonts w:ascii="Times New Roman" w:hAnsi="Times New Roman" w:eastAsia="Batang"/>
+          <w:sz w:val="22"/>
+        </w:rPr>
+        <w:t xml:space="preserve"> Aggregate functions accepted by </w:t>
+      </w:r>
+      <w:r>
+        <w:rPr>
+          <w:rFonts w:ascii="Consolas" w:hAnsi="Consolas" w:eastAsia="Consolas"/>
+          <w:sz w:val="18"/>
+        </w:rPr>
+        <w:t>aggregate</w:t>
+      </w:r>
+    </w:p>
+    <w:p>
+      <w:pPr>
+        <w:pStyle w:val="ListBullet"/>
+        <w:spacing w:line="384" w:lineRule="auto" w:after="120"/>
+      </w:pPr>
+      <w:r>
+        <w:rPr>
+          <w:rFonts w:ascii="Consolas" w:hAnsi="Consolas" w:eastAsia="Consolas"/>
+          <w:sz w:val="18"/>
+        </w:rPr>
+        <w:t>&lt;Table 3-1&gt;</w:t>
+      </w:r>
+      <w:r>
+        <w:rPr>
+          <w:rFonts w:ascii="Times New Roman" w:hAnsi="Times New Roman" w:eastAsia="Batang"/>
+          <w:sz w:val="22"/>
+        </w:rPr>
+        <w:t xml:space="preserve"> </w:t>
+      </w:r>
+      <w:r>
+        <w:rPr>
+          <w:rFonts w:ascii="Consolas" w:hAnsi="Consolas" w:eastAsia="Consolas"/>
+          <w:sz w:val="18"/>
+        </w:rPr>
+        <w:t>witchhat.spark</w:t>
+      </w:r>
+      <w:r>
+        <w:rPr>
+          <w:rFonts w:ascii="Times New Roman" w:hAnsi="Times New Roman" w:eastAsia="Batang"/>
+          <w:sz w:val="22"/>
+        </w:rPr>
+        <w:t xml:space="preserve"> functions</w:t>
+      </w:r>
+    </w:p>
+    <w:p>
+      <w:pPr>
+        <w:pStyle w:val="ListBullet"/>
+        <w:spacing w:line="384" w:lineRule="auto" w:after="120"/>
+      </w:pPr>
+      <w:r>
+        <w:rPr>
+          <w:rFonts w:ascii="Consolas" w:hAnsi="Consolas" w:eastAsia="Consolas"/>
+          <w:sz w:val="18"/>
+        </w:rPr>
         <w:t>&lt;Table 4-1&gt;</w:t>
+      </w:r>
+      <w:r>
+        <w:rPr>
+          <w:rFonts w:ascii="Times New Roman" w:hAnsi="Times New Roman" w:eastAsia="Batang"/>
+          <w:sz w:val="22"/>
+        </w:rPr>
+        <w:t xml:space="preserve"> Fields common to every metric event</w:t>
+      </w:r>
+    </w:p>
+    <w:p>
+      <w:pPr>
+        <w:pStyle w:val="ListBullet"/>
+        <w:spacing w:line="384" w:lineRule="auto" w:after="120"/>
+      </w:pPr>
+      <w:r>
+        <w:rPr>
+          <w:rFonts w:ascii="Consolas" w:hAnsi="Consolas" w:eastAsia="Consolas"/>
+          <w:sz w:val="18"/>
+        </w:rPr>
+        <w:t>&lt;Table 5-1&gt;</w:t>
       </w:r>
       <w:r>
         <w:rPr>
@@ -7838,7 +7993,1093 @@
           <w:color w:val="000000"/>
           <w:sz w:val="26"/>
         </w:rPr>
-        <w:t>IV. Rust Surface</w:t>
+        <w:t>IV. Metric Logging (</w:t>
+      </w:r>
+      <w:r>
+        <w:rPr>
+          <w:rFonts w:ascii="Consolas" w:hAnsi="Consolas" w:eastAsia="Consolas"/>
+          <w:b/>
+          <w:color w:val="000000"/>
+          <w:sz w:val="26"/>
+        </w:rPr>
+        <w:t>witchhat.metrics</w:t>
+      </w:r>
+      <w:r>
+        <w:rPr>
+          <w:rFonts w:ascii="Times New Roman" w:hAnsi="Times New Roman" w:eastAsia="Batang"/>
+          <w:b/>
+          <w:color w:val="000000"/>
+          <w:sz w:val="26"/>
+        </w:rPr>
+        <w:t>)</w:t>
+      </w:r>
+    </w:p>
+    <w:p>
+      <w:pPr>
+        <w:spacing w:line="384" w:lineRule="auto" w:after="120"/>
+        <w:jc w:val="both"/>
+      </w:pPr>
+      <w:r>
+        <w:rPr>
+          <w:rFonts w:ascii="Times New Roman" w:hAnsi="Times New Roman" w:eastAsia="Batang"/>
+          <w:sz w:val="22"/>
+        </w:rPr>
+        <w:t xml:space="preserve">Optional JSON instrumentation for every function in Chapter II, applied automatically to every </w:t>
+      </w:r>
+      <w:r>
+        <w:rPr>
+          <w:rFonts w:ascii="Consolas" w:hAnsi="Consolas" w:eastAsia="Consolas"/>
+          <w:sz w:val="18"/>
+        </w:rPr>
+        <w:t>witchhat.spark</w:t>
+      </w:r>
+      <w:r>
+        <w:rPr>
+          <w:rFonts w:ascii="Times New Roman" w:hAnsi="Times New Roman" w:eastAsia="Batang"/>
+          <w:sz w:val="22"/>
+        </w:rPr>
+        <w:t xml:space="preserve"> call too (Chapter III), since those call straight into the same, instrumented functions. Disabled by default and free when disabled. See </w:t>
+      </w:r>
+      <w:r>
+        <w:rPr>
+          <w:rFonts w:ascii="Consolas" w:hAnsi="Consolas" w:eastAsia="Consolas"/>
+          <w:sz w:val="18"/>
+        </w:rPr>
+        <w:t>architecture.md</w:t>
+      </w:r>
+      <w:r>
+        <w:rPr>
+          <w:rFonts w:ascii="Times New Roman" w:hAnsi="Times New Roman" w:eastAsia="Batang"/>
+          <w:sz w:val="22"/>
+        </w:rPr>
+        <w:t xml:space="preserve"> Chapter XVII for the design.</w:t>
+      </w:r>
+    </w:p>
+    <w:p>
+      <w:pPr>
+        <w:spacing w:line="240" w:lineRule="auto" w:before="120" w:after="120"/>
+        <w:ind w:left="454"/>
+      </w:pPr>
+      <w:r>
+        <w:rPr>
+          <w:rFonts w:ascii="Consolas" w:hAnsi="Consolas" w:eastAsia="Consolas"/>
+          <w:sz w:val="18"/>
+        </w:rPr>
+        <w:t>witchhat.metrics.enable(sink="stdout") -&gt; None</w:t>
+        <w:br/>
+        <w:t>witchhat.metrics.disable() -&gt; None</w:t>
+        <w:br/>
+        <w:t>witchhat.metrics.is_enabled() -&gt; bool</w:t>
+        <w:br/>
+        <w:t>witchhat.metrics.row_count(obj) -&gt; int | None</w:t>
+        <w:br/>
+        <w:t>witchhat.metrics.measure(function, **context) -&gt; contextmanager</w:t>
+      </w:r>
+    </w:p>
+    <w:p>
+      <w:pPr>
+        <w:pStyle w:val="Heading2"/>
+      </w:pPr>
+      <w:r>
+        <w:rPr>
+          <w:rFonts w:ascii="Times New Roman" w:hAnsi="Times New Roman" w:eastAsia="Batang"/>
+          <w:b/>
+          <w:color w:val="000000"/>
+          <w:sz w:val="24"/>
+        </w:rPr>
+        <w:t xml:space="preserve">1. </w:t>
+      </w:r>
+      <w:r>
+        <w:rPr>
+          <w:rFonts w:ascii="Consolas" w:hAnsi="Consolas" w:eastAsia="Consolas"/>
+          <w:b/>
+          <w:color w:val="000000"/>
+          <w:sz w:val="24"/>
+        </w:rPr>
+        <w:t>enable</w:t>
+      </w:r>
+      <w:r>
+        <w:rPr>
+          <w:rFonts w:ascii="Times New Roman" w:hAnsi="Times New Roman" w:eastAsia="Batang"/>
+          <w:b/>
+          <w:color w:val="000000"/>
+          <w:sz w:val="24"/>
+        </w:rPr>
+        <w:t xml:space="preserve">, </w:t>
+      </w:r>
+      <w:r>
+        <w:rPr>
+          <w:rFonts w:ascii="Consolas" w:hAnsi="Consolas" w:eastAsia="Consolas"/>
+          <w:b/>
+          <w:color w:val="000000"/>
+          <w:sz w:val="24"/>
+        </w:rPr>
+        <w:t>disable</w:t>
+      </w:r>
+      <w:r>
+        <w:rPr>
+          <w:rFonts w:ascii="Times New Roman" w:hAnsi="Times New Roman" w:eastAsia="Batang"/>
+          <w:b/>
+          <w:color w:val="000000"/>
+          <w:sz w:val="24"/>
+        </w:rPr>
+        <w:t xml:space="preserve">, </w:t>
+      </w:r>
+      <w:r>
+        <w:rPr>
+          <w:rFonts w:ascii="Consolas" w:hAnsi="Consolas" w:eastAsia="Consolas"/>
+          <w:b/>
+          <w:color w:val="000000"/>
+          <w:sz w:val="24"/>
+        </w:rPr>
+        <w:t>is_enabled</w:t>
+      </w:r>
+    </w:p>
+    <w:p>
+      <w:pPr>
+        <w:spacing w:line="384" w:lineRule="auto" w:after="120"/>
+        <w:jc w:val="both"/>
+      </w:pPr>
+      <w:r>
+        <w:rPr>
+          <w:rFonts w:ascii="Consolas" w:hAnsi="Consolas" w:eastAsia="Consolas"/>
+          <w:sz w:val="18"/>
+        </w:rPr>
+        <w:t>enable(sink="stdout")</w:t>
+      </w:r>
+      <w:r>
+        <w:rPr>
+          <w:rFonts w:ascii="Times New Roman" w:hAnsi="Times New Roman" w:eastAsia="Batang"/>
+          <w:sz w:val="22"/>
+        </w:rPr>
+        <w:t xml:space="preserve"> turns on metric logging: every wrapped call in Chapter II (and transitively Chapter III) emits one JSON event to </w:t>
+      </w:r>
+      <w:r>
+        <w:rPr>
+          <w:rFonts w:ascii="Consolas" w:hAnsi="Consolas" w:eastAsia="Consolas"/>
+          <w:sz w:val="18"/>
+        </w:rPr>
+        <w:t>sink</w:t>
+      </w:r>
+      <w:r>
+        <w:rPr>
+          <w:rFonts w:ascii="Times New Roman" w:hAnsi="Times New Roman" w:eastAsia="Batang"/>
+          <w:sz w:val="22"/>
+        </w:rPr>
+        <w:t xml:space="preserve"> on completion, success or failure. </w:t>
+      </w:r>
+      <w:r>
+        <w:rPr>
+          <w:rFonts w:ascii="Consolas" w:hAnsi="Consolas" w:eastAsia="Consolas"/>
+          <w:sz w:val="18"/>
+        </w:rPr>
+        <w:t>sink</w:t>
+      </w:r>
+      <w:r>
+        <w:rPr>
+          <w:rFonts w:ascii="Times New Roman" w:hAnsi="Times New Roman" w:eastAsia="Batang"/>
+          <w:sz w:val="22"/>
+        </w:rPr>
+        <w:t xml:space="preserve"> is </w:t>
+      </w:r>
+      <w:r>
+        <w:rPr>
+          <w:rFonts w:ascii="Consolas" w:hAnsi="Consolas" w:eastAsia="Consolas"/>
+          <w:sz w:val="18"/>
+        </w:rPr>
+        <w:t>"stdout"</w:t>
+      </w:r>
+      <w:r>
+        <w:rPr>
+          <w:rFonts w:ascii="Times New Roman" w:hAnsi="Times New Roman" w:eastAsia="Batang"/>
+          <w:sz w:val="22"/>
+        </w:rPr>
+        <w:t xml:space="preserve"> (JSON lines, the default), a file path (</w:t>
+      </w:r>
+      <w:r>
+        <w:rPr>
+          <w:rFonts w:ascii="Consolas" w:hAnsi="Consolas" w:eastAsia="Consolas"/>
+          <w:sz w:val="18"/>
+        </w:rPr>
+        <w:t>str</w:t>
+      </w:r>
+      <w:r>
+        <w:rPr>
+          <w:rFonts w:ascii="Times New Roman" w:hAnsi="Times New Roman" w:eastAsia="Batang"/>
+          <w:sz w:val="22"/>
+        </w:rPr>
+        <w:t>/</w:t>
+      </w:r>
+      <w:r>
+        <w:rPr>
+          <w:rFonts w:ascii="Consolas" w:hAnsi="Consolas" w:eastAsia="Consolas"/>
+          <w:sz w:val="18"/>
+        </w:rPr>
+        <w:t>Path</w:t>
+      </w:r>
+      <w:r>
+        <w:rPr>
+          <w:rFonts w:ascii="Times New Roman" w:hAnsi="Times New Roman" w:eastAsia="Batang"/>
+          <w:sz w:val="22"/>
+        </w:rPr>
+        <w:t xml:space="preserve">, lines appended), or a callable receiving each event as a </w:t>
+      </w:r>
+      <w:r>
+        <w:rPr>
+          <w:rFonts w:ascii="Consolas" w:hAnsi="Consolas" w:eastAsia="Consolas"/>
+          <w:sz w:val="18"/>
+        </w:rPr>
+        <w:t>dict</w:t>
+      </w:r>
+      <w:r>
+        <w:rPr>
+          <w:rFonts w:ascii="Times New Roman" w:hAnsi="Times New Roman" w:eastAsia="Batang"/>
+          <w:sz w:val="22"/>
+        </w:rPr>
+        <w:t xml:space="preserve"> (the extension point for routing into a logger, a </w:t>
+      </w:r>
+      <w:r>
+        <w:rPr>
+          <w:rFonts w:ascii="Consolas" w:hAnsi="Consolas" w:eastAsia="Consolas"/>
+          <w:sz w:val="18"/>
+        </w:rPr>
+        <w:t>pyspark.Accumulator</w:t>
+      </w:r>
+      <w:r>
+        <w:rPr>
+          <w:rFonts w:ascii="Times New Roman" w:hAnsi="Times New Roman" w:eastAsia="Batang"/>
+          <w:sz w:val="22"/>
+        </w:rPr>
+        <w:t xml:space="preserve">, or anything else). </w:t>
+      </w:r>
+      <w:r>
+        <w:rPr>
+          <w:rFonts w:ascii="Consolas" w:hAnsi="Consolas" w:eastAsia="Consolas"/>
+          <w:sz w:val="18"/>
+        </w:rPr>
+        <w:t>disable()</w:t>
+      </w:r>
+      <w:r>
+        <w:rPr>
+          <w:rFonts w:ascii="Times New Roman" w:hAnsi="Times New Roman" w:eastAsia="Batang"/>
+          <w:sz w:val="22"/>
+        </w:rPr>
+        <w:t xml:space="preserve"> turns it back off; </w:t>
+      </w:r>
+      <w:r>
+        <w:rPr>
+          <w:rFonts w:ascii="Consolas" w:hAnsi="Consolas" w:eastAsia="Consolas"/>
+          <w:sz w:val="18"/>
+        </w:rPr>
+        <w:t>is_enabled()</w:t>
+      </w:r>
+      <w:r>
+        <w:rPr>
+          <w:rFonts w:ascii="Times New Roman" w:hAnsi="Times New Roman" w:eastAsia="Batang"/>
+          <w:sz w:val="22"/>
+        </w:rPr>
+        <w:t xml:space="preserve"> reports the current state.</w:t>
+      </w:r>
+    </w:p>
+    <w:p>
+      <w:pPr>
+        <w:pStyle w:val="Heading2"/>
+      </w:pPr>
+      <w:r>
+        <w:rPr>
+          <w:rFonts w:ascii="Times New Roman" w:hAnsi="Times New Roman" w:eastAsia="Batang"/>
+          <w:b/>
+          <w:color w:val="000000"/>
+          <w:sz w:val="24"/>
+        </w:rPr>
+        <w:t>2. Event shape</w:t>
+      </w:r>
+    </w:p>
+    <w:p>
+      <w:pPr>
+        <w:spacing w:line="384" w:lineRule="auto" w:after="120"/>
+        <w:jc w:val="both"/>
+      </w:pPr>
+      <w:r>
+        <w:rPr>
+          <w:rFonts w:ascii="Times New Roman" w:hAnsi="Times New Roman" w:eastAsia="Batang"/>
+          <w:sz w:val="22"/>
+        </w:rPr>
+        <w:t>&lt;Table 4-1&gt; Fields common to every metric event</w:t>
+      </w:r>
+    </w:p>
+    <w:tbl>
+      <w:tblPr>
+        <w:tblStyle w:val="TableGrid"/>
+        <w:tblW w:type="auto" w:w="0"/>
+        <w:jc w:val="center"/>
+        <w:tblLook w:firstColumn="1" w:firstRow="1" w:lastColumn="0" w:lastRow="0" w:noHBand="0" w:noVBand="1" w:val="04A0"/>
+      </w:tblPr>
+      <w:tblGrid>
+        <w:gridCol w:w="3135"/>
+        <w:gridCol w:w="3135"/>
+        <w:gridCol w:w="3135"/>
+      </w:tblGrid>
+      <w:tr>
+        <w:tc>
+          <w:tcPr>
+            <w:tcW w:type="dxa" w:w="3135"/>
+          </w:tcPr>
+          <w:p>
+            <w:pPr>
+              <w:jc w:val="center"/>
+            </w:pPr>
+            <w:r>
+              <w:rPr>
+                <w:rFonts w:ascii="Times New Roman" w:hAnsi="Times New Roman" w:eastAsia="Batang"/>
+                <w:b/>
+                <w:sz w:val="22"/>
+              </w:rPr>
+              <w:t>Field</w:t>
+            </w:r>
+          </w:p>
+        </w:tc>
+        <w:tc>
+          <w:tcPr>
+            <w:tcW w:type="dxa" w:w="3135"/>
+          </w:tcPr>
+          <w:p>
+            <w:pPr>
+              <w:jc w:val="center"/>
+            </w:pPr>
+            <w:r>
+              <w:rPr>
+                <w:rFonts w:ascii="Times New Roman" w:hAnsi="Times New Roman" w:eastAsia="Batang"/>
+                <w:b/>
+                <w:sz w:val="22"/>
+              </w:rPr>
+              <w:t>Type</w:t>
+            </w:r>
+          </w:p>
+        </w:tc>
+        <w:tc>
+          <w:tcPr>
+            <w:tcW w:type="dxa" w:w="3135"/>
+          </w:tcPr>
+          <w:p>
+            <w:pPr>
+              <w:jc w:val="center"/>
+            </w:pPr>
+            <w:r>
+              <w:rPr>
+                <w:rFonts w:ascii="Times New Roman" w:hAnsi="Times New Roman" w:eastAsia="Batang"/>
+                <w:b/>
+                <w:sz w:val="22"/>
+              </w:rPr>
+              <w:t>Meaning</w:t>
+            </w:r>
+          </w:p>
+        </w:tc>
+      </w:tr>
+      <w:tr>
+        <w:tc>
+          <w:tcPr>
+            <w:tcW w:type="dxa" w:w="3135"/>
+          </w:tcPr>
+          <w:p>
+            <w:r>
+              <w:rPr>
+                <w:rFonts w:ascii="Consolas" w:hAnsi="Consolas" w:eastAsia="Consolas"/>
+                <w:sz w:val="18"/>
+              </w:rPr>
+              <w:t>function</w:t>
+            </w:r>
+          </w:p>
+        </w:tc>
+        <w:tc>
+          <w:tcPr>
+            <w:tcW w:type="dxa" w:w="3135"/>
+          </w:tcPr>
+          <w:p>
+            <w:r>
+              <w:rPr>
+                <w:rFonts w:ascii="Consolas" w:hAnsi="Consolas" w:eastAsia="Consolas"/>
+                <w:sz w:val="18"/>
+              </w:rPr>
+              <w:t>str</w:t>
+            </w:r>
+          </w:p>
+        </w:tc>
+        <w:tc>
+          <w:tcPr>
+            <w:tcW w:type="dxa" w:w="3135"/>
+          </w:tcPr>
+          <w:p>
+            <w:r>
+              <w:rPr>
+                <w:rFonts w:ascii="Times New Roman" w:hAnsi="Times New Roman" w:eastAsia="Batang"/>
+                <w:sz w:val="22"/>
+              </w:rPr>
+              <w:t>Which witchhat function was called</w:t>
+            </w:r>
+          </w:p>
+        </w:tc>
+      </w:tr>
+      <w:tr>
+        <w:tc>
+          <w:tcPr>
+            <w:tcW w:type="dxa" w:w="3135"/>
+          </w:tcPr>
+          <w:p>
+            <w:r>
+              <w:rPr>
+                <w:rFonts w:ascii="Consolas" w:hAnsi="Consolas" w:eastAsia="Consolas"/>
+                <w:sz w:val="18"/>
+              </w:rPr>
+              <w:t>ts</w:t>
+            </w:r>
+          </w:p>
+        </w:tc>
+        <w:tc>
+          <w:tcPr>
+            <w:tcW w:type="dxa" w:w="3135"/>
+          </w:tcPr>
+          <w:p>
+            <w:r>
+              <w:rPr>
+                <w:rFonts w:ascii="Consolas" w:hAnsi="Consolas" w:eastAsia="Consolas"/>
+                <w:sz w:val="18"/>
+              </w:rPr>
+              <w:t>str</w:t>
+            </w:r>
+          </w:p>
+        </w:tc>
+        <w:tc>
+          <w:tcPr>
+            <w:tcW w:type="dxa" w:w="3135"/>
+          </w:tcPr>
+          <w:p>
+            <w:r>
+              <w:rPr>
+                <w:rFonts w:ascii="Times New Roman" w:hAnsi="Times New Roman" w:eastAsia="Batang"/>
+                <w:sz w:val="22"/>
+              </w:rPr>
+              <w:t>ISO 8601 UTC timestamp</w:t>
+            </w:r>
+          </w:p>
+        </w:tc>
+      </w:tr>
+      <w:tr>
+        <w:tc>
+          <w:tcPr>
+            <w:tcW w:type="dxa" w:w="3135"/>
+          </w:tcPr>
+          <w:p>
+            <w:r>
+              <w:rPr>
+                <w:rFonts w:ascii="Consolas" w:hAnsi="Consolas" w:eastAsia="Consolas"/>
+                <w:sz w:val="18"/>
+              </w:rPr>
+              <w:t>status</w:t>
+            </w:r>
+          </w:p>
+        </w:tc>
+        <w:tc>
+          <w:tcPr>
+            <w:tcW w:type="dxa" w:w="3135"/>
+          </w:tcPr>
+          <w:p>
+            <w:r>
+              <w:rPr>
+                <w:rFonts w:ascii="Consolas" w:hAnsi="Consolas" w:eastAsia="Consolas"/>
+                <w:sz w:val="18"/>
+              </w:rPr>
+              <w:t>str</w:t>
+            </w:r>
+          </w:p>
+        </w:tc>
+        <w:tc>
+          <w:tcPr>
+            <w:tcW w:type="dxa" w:w="3135"/>
+          </w:tcPr>
+          <w:p>
+            <w:r>
+              <w:rPr>
+                <w:rFonts w:ascii="Consolas" w:hAnsi="Consolas" w:eastAsia="Consolas"/>
+                <w:sz w:val="18"/>
+              </w:rPr>
+              <w:t>"ok"</w:t>
+            </w:r>
+            <w:r>
+              <w:rPr>
+                <w:rFonts w:ascii="Times New Roman" w:hAnsi="Times New Roman" w:eastAsia="Batang"/>
+                <w:sz w:val="22"/>
+              </w:rPr>
+              <w:t xml:space="preserve"> or </w:t>
+            </w:r>
+            <w:r>
+              <w:rPr>
+                <w:rFonts w:ascii="Consolas" w:hAnsi="Consolas" w:eastAsia="Consolas"/>
+                <w:sz w:val="18"/>
+              </w:rPr>
+              <w:t>"error"</w:t>
+            </w:r>
+          </w:p>
+        </w:tc>
+      </w:tr>
+      <w:tr>
+        <w:tc>
+          <w:tcPr>
+            <w:tcW w:type="dxa" w:w="3135"/>
+          </w:tcPr>
+          <w:p>
+            <w:r>
+              <w:rPr>
+                <w:rFonts w:ascii="Consolas" w:hAnsi="Consolas" w:eastAsia="Consolas"/>
+                <w:sz w:val="18"/>
+              </w:rPr>
+              <w:t>duration_ms</w:t>
+            </w:r>
+          </w:p>
+        </w:tc>
+        <w:tc>
+          <w:tcPr>
+            <w:tcW w:type="dxa" w:w="3135"/>
+          </w:tcPr>
+          <w:p>
+            <w:r>
+              <w:rPr>
+                <w:rFonts w:ascii="Consolas" w:hAnsi="Consolas" w:eastAsia="Consolas"/>
+                <w:sz w:val="18"/>
+              </w:rPr>
+              <w:t>float</w:t>
+            </w:r>
+          </w:p>
+        </w:tc>
+        <w:tc>
+          <w:tcPr>
+            <w:tcW w:type="dxa" w:w="3135"/>
+          </w:tcPr>
+          <w:p>
+            <w:r>
+              <w:rPr>
+                <w:rFonts w:ascii="Times New Roman" w:hAnsi="Times New Roman" w:eastAsia="Batang"/>
+                <w:sz w:val="22"/>
+              </w:rPr>
+              <w:t>Wall-clock time of the call</w:t>
+            </w:r>
+          </w:p>
+        </w:tc>
+      </w:tr>
+      <w:tr>
+        <w:tc>
+          <w:tcPr>
+            <w:tcW w:type="dxa" w:w="3135"/>
+          </w:tcPr>
+          <w:p>
+            <w:r>
+              <w:rPr>
+                <w:rFonts w:ascii="Consolas" w:hAnsi="Consolas" w:eastAsia="Consolas"/>
+                <w:sz w:val="18"/>
+              </w:rPr>
+              <w:t>error</w:t>
+            </w:r>
+          </w:p>
+        </w:tc>
+        <w:tc>
+          <w:tcPr>
+            <w:tcW w:type="dxa" w:w="3135"/>
+          </w:tcPr>
+          <w:p>
+            <w:r>
+              <w:rPr>
+                <w:rFonts w:ascii="Consolas" w:hAnsi="Consolas" w:eastAsia="Consolas"/>
+                <w:sz w:val="18"/>
+              </w:rPr>
+              <w:t>str</w:t>
+            </w:r>
+            <w:r>
+              <w:rPr>
+                <w:rFonts w:ascii="Times New Roman" w:hAnsi="Times New Roman" w:eastAsia="Batang"/>
+                <w:sz w:val="22"/>
+              </w:rPr>
+              <w:t>, present only on failure</w:t>
+            </w:r>
+          </w:p>
+        </w:tc>
+        <w:tc>
+          <w:tcPr>
+            <w:tcW w:type="dxa" w:w="3135"/>
+          </w:tcPr>
+          <w:p>
+            <w:r>
+              <w:rPr>
+                <w:rFonts w:ascii="Times New Roman" w:hAnsi="Times New Roman" w:eastAsia="Batang"/>
+                <w:sz w:val="22"/>
+              </w:rPr>
+              <w:t>The exception's type and message, never its traceback</w:t>
+            </w:r>
+          </w:p>
+        </w:tc>
+      </w:tr>
+      <w:tr>
+        <w:tc>
+          <w:tcPr>
+            <w:tcW w:type="dxa" w:w="3135"/>
+          </w:tcPr>
+          <w:p>
+            <w:r>
+              <w:rPr>
+                <w:rFonts w:ascii="Consolas" w:hAnsi="Consolas" w:eastAsia="Consolas"/>
+                <w:sz w:val="18"/>
+              </w:rPr>
+              <w:t>rows_in</w:t>
+            </w:r>
+            <w:r>
+              <w:rPr>
+                <w:rFonts w:ascii="Times New Roman" w:hAnsi="Times New Roman" w:eastAsia="Batang"/>
+                <w:sz w:val="22"/>
+              </w:rPr>
+              <w:t xml:space="preserve">, </w:t>
+            </w:r>
+            <w:r>
+              <w:rPr>
+                <w:rFonts w:ascii="Consolas" w:hAnsi="Consolas" w:eastAsia="Consolas"/>
+                <w:sz w:val="18"/>
+              </w:rPr>
+              <w:t>rows_out</w:t>
+            </w:r>
+          </w:p>
+        </w:tc>
+        <w:tc>
+          <w:tcPr>
+            <w:tcW w:type="dxa" w:w="3135"/>
+          </w:tcPr>
+          <w:p>
+            <w:r>
+              <w:rPr>
+                <w:rFonts w:ascii="Times New Roman" w:hAnsi="Times New Roman" w:eastAsia="Batang"/>
+                <w:sz w:val="22"/>
+              </w:rPr>
+              <w:t>`int \</w:t>
+            </w:r>
+          </w:p>
+        </w:tc>
+        <w:tc>
+          <w:tcPr>
+            <w:tcW w:type="dxa" w:w="3135"/>
+          </w:tcPr>
+          <w:p>
+            <w:r>
+              <w:rPr>
+                <w:rFonts w:ascii="Times New Roman" w:hAnsi="Times New Roman" w:eastAsia="Batang"/>
+                <w:sz w:val="22"/>
+              </w:rPr>
+              <w:t>None`, where applicable</w:t>
+            </w:r>
+          </w:p>
+        </w:tc>
+      </w:tr>
+      <w:tr>
+        <w:tc>
+          <w:tcPr>
+            <w:tcW w:type="dxa" w:w="3135"/>
+          </w:tcPr>
+          <w:p>
+            <w:r>
+              <w:rPr>
+                <w:rFonts w:ascii="Consolas" w:hAnsi="Consolas" w:eastAsia="Consolas"/>
+                <w:sz w:val="18"/>
+              </w:rPr>
+              <w:t>rows_per_second</w:t>
+            </w:r>
+          </w:p>
+        </w:tc>
+        <w:tc>
+          <w:tcPr>
+            <w:tcW w:type="dxa" w:w="3135"/>
+          </w:tcPr>
+          <w:p>
+            <w:r>
+              <w:rPr>
+                <w:rFonts w:ascii="Consolas" w:hAnsi="Consolas" w:eastAsia="Consolas"/>
+                <w:sz w:val="18"/>
+              </w:rPr>
+              <w:t>float</w:t>
+            </w:r>
+            <w:r>
+              <w:rPr>
+                <w:rFonts w:ascii="Times New Roman" w:hAnsi="Times New Roman" w:eastAsia="Batang"/>
+                <w:sz w:val="22"/>
+              </w:rPr>
+              <w:t xml:space="preserve">, present when </w:t>
+            </w:r>
+            <w:r>
+              <w:rPr>
+                <w:rFonts w:ascii="Consolas" w:hAnsi="Consolas" w:eastAsia="Consolas"/>
+                <w:sz w:val="18"/>
+              </w:rPr>
+              <w:t>rows_in</w:t>
+            </w:r>
+            <w:r>
+              <w:rPr>
+                <w:rFonts w:ascii="Times New Roman" w:hAnsi="Times New Roman" w:eastAsia="Batang"/>
+                <w:sz w:val="22"/>
+              </w:rPr>
+              <w:t xml:space="preserve"> is known</w:t>
+            </w:r>
+          </w:p>
+        </w:tc>
+        <w:tc>
+          <w:tcPr>
+            <w:tcW w:type="dxa" w:w="3135"/>
+          </w:tcPr>
+          <w:p>
+            <w:r>
+              <w:rPr>
+                <w:rFonts w:ascii="Consolas" w:hAnsi="Consolas" w:eastAsia="Consolas"/>
+                <w:sz w:val="18"/>
+              </w:rPr>
+              <w:t>rows_in</w:t>
+            </w:r>
+            <w:r>
+              <w:rPr>
+                <w:rFonts w:ascii="Times New Roman" w:hAnsi="Times New Roman" w:eastAsia="Batang"/>
+                <w:sz w:val="22"/>
+              </w:rPr>
+              <w:t xml:space="preserve"> divided by </w:t>
+            </w:r>
+            <w:r>
+              <w:rPr>
+                <w:rFonts w:ascii="Consolas" w:hAnsi="Consolas" w:eastAsia="Consolas"/>
+                <w:sz w:val="18"/>
+              </w:rPr>
+              <w:t>duration_ms</w:t>
+            </w:r>
+          </w:p>
+        </w:tc>
+      </w:tr>
+    </w:tbl>
+    <w:p/>
+    <w:p>
+      <w:pPr>
+        <w:spacing w:line="384" w:lineRule="auto" w:after="120"/>
+        <w:jc w:val="both"/>
+      </w:pPr>
+      <w:r>
+        <w:rPr>
+          <w:rFonts w:ascii="Times New Roman" w:hAnsi="Times New Roman" w:eastAsia="Batang"/>
+          <w:sz w:val="22"/>
+        </w:rPr>
+        <w:t xml:space="preserve">Every function also adds its own schema-level parameters: </w:t>
+      </w:r>
+      <w:r>
+        <w:rPr>
+          <w:rFonts w:ascii="Consolas" w:hAnsi="Consolas" w:eastAsia="Consolas"/>
+          <w:sz w:val="18"/>
+        </w:rPr>
+        <w:t>hash_rows</w:t>
+      </w:r>
+      <w:r>
+        <w:rPr>
+          <w:rFonts w:ascii="Times New Roman" w:hAnsi="Times New Roman" w:eastAsia="Batang"/>
+          <w:sz w:val="22"/>
+        </w:rPr>
+        <w:t xml:space="preserve"> adds </w:t>
+      </w:r>
+      <w:r>
+        <w:rPr>
+          <w:rFonts w:ascii="Consolas" w:hAnsi="Consolas" w:eastAsia="Consolas"/>
+          <w:sz w:val="18"/>
+        </w:rPr>
+        <w:t>columns</w:t>
+      </w:r>
+      <w:r>
+        <w:rPr>
+          <w:rFonts w:ascii="Times New Roman" w:hAnsi="Times New Roman" w:eastAsia="Batang"/>
+          <w:sz w:val="22"/>
+        </w:rPr>
+        <w:t xml:space="preserve"> and </w:t>
+      </w:r>
+      <w:r>
+        <w:rPr>
+          <w:rFonts w:ascii="Consolas" w:hAnsi="Consolas" w:eastAsia="Consolas"/>
+          <w:sz w:val="18"/>
+        </w:rPr>
+        <w:t>version</w:t>
+      </w:r>
+      <w:r>
+        <w:rPr>
+          <w:rFonts w:ascii="Times New Roman" w:hAnsi="Times New Roman" w:eastAsia="Batang"/>
+          <w:sz w:val="22"/>
+        </w:rPr>
+        <w:t xml:space="preserve">; </w:t>
+      </w:r>
+      <w:r>
+        <w:rPr>
+          <w:rFonts w:ascii="Consolas" w:hAnsi="Consolas" w:eastAsia="Consolas"/>
+          <w:sz w:val="18"/>
+        </w:rPr>
+        <w:t>join</w:t>
+      </w:r>
+      <w:r>
+        <w:rPr>
+          <w:rFonts w:ascii="Times New Roman" w:hAnsi="Times New Roman" w:eastAsia="Batang"/>
+          <w:sz w:val="22"/>
+        </w:rPr>
+        <w:t xml:space="preserve"> adds </w:t>
+      </w:r>
+      <w:r>
+        <w:rPr>
+          <w:rFonts w:ascii="Consolas" w:hAnsi="Consolas" w:eastAsia="Consolas"/>
+          <w:sz w:val="18"/>
+        </w:rPr>
+        <w:t>left_keys</w:t>
+      </w:r>
+      <w:r>
+        <w:rPr>
+          <w:rFonts w:ascii="Times New Roman" w:hAnsi="Times New Roman" w:eastAsia="Batang"/>
+          <w:sz w:val="22"/>
+        </w:rPr>
+        <w:t>/</w:t>
+      </w:r>
+      <w:r>
+        <w:rPr>
+          <w:rFonts w:ascii="Consolas" w:hAnsi="Consolas" w:eastAsia="Consolas"/>
+          <w:sz w:val="18"/>
+        </w:rPr>
+        <w:t>right_keys</w:t>
+      </w:r>
+      <w:r>
+        <w:rPr>
+          <w:rFonts w:ascii="Times New Roman" w:hAnsi="Times New Roman" w:eastAsia="Batang"/>
+          <w:sz w:val="22"/>
+        </w:rPr>
+        <w:t>/</w:t>
+      </w:r>
+      <w:r>
+        <w:rPr>
+          <w:rFonts w:ascii="Consolas" w:hAnsi="Consolas" w:eastAsia="Consolas"/>
+          <w:sz w:val="18"/>
+        </w:rPr>
+        <w:t>how</w:t>
+      </w:r>
+      <w:r>
+        <w:rPr>
+          <w:rFonts w:ascii="Times New Roman" w:hAnsi="Times New Roman" w:eastAsia="Batang"/>
+          <w:sz w:val="22"/>
+        </w:rPr>
+        <w:t xml:space="preserve"> and a second </w:t>
+      </w:r>
+      <w:r>
+        <w:rPr>
+          <w:rFonts w:ascii="Consolas" w:hAnsi="Consolas" w:eastAsia="Consolas"/>
+          <w:sz w:val="18"/>
+        </w:rPr>
+        <w:t>rows_in_right</w:t>
+      </w:r>
+      <w:r>
+        <w:rPr>
+          <w:rFonts w:ascii="Times New Roman" w:hAnsi="Times New Roman" w:eastAsia="Batang"/>
+          <w:sz w:val="22"/>
+        </w:rPr>
+        <w:t xml:space="preserve">; </w:t>
+      </w:r>
+      <w:r>
+        <w:rPr>
+          <w:rFonts w:ascii="Consolas" w:hAnsi="Consolas" w:eastAsia="Consolas"/>
+          <w:sz w:val="18"/>
+        </w:rPr>
+        <w:t>aggregate</w:t>
+      </w:r>
+      <w:r>
+        <w:rPr>
+          <w:rFonts w:ascii="Times New Roman" w:hAnsi="Times New Roman" w:eastAsia="Batang"/>
+          <w:sz w:val="22"/>
+        </w:rPr>
+        <w:t xml:space="preserve"> adds </w:t>
+      </w:r>
+      <w:r>
+        <w:rPr>
+          <w:rFonts w:ascii="Consolas" w:hAnsi="Consolas" w:eastAsia="Consolas"/>
+          <w:sz w:val="18"/>
+        </w:rPr>
+        <w:t>group_by</w:t>
+      </w:r>
+      <w:r>
+        <w:rPr>
+          <w:rFonts w:ascii="Times New Roman" w:hAnsi="Times New Roman" w:eastAsia="Batang"/>
+          <w:sz w:val="22"/>
+        </w:rPr>
+        <w:t xml:space="preserve"> and </w:t>
+      </w:r>
+      <w:r>
+        <w:rPr>
+          <w:rFonts w:ascii="Consolas" w:hAnsi="Consolas" w:eastAsia="Consolas"/>
+          <w:sz w:val="18"/>
+        </w:rPr>
+        <w:t>aggregation_count</w:t>
+      </w:r>
+      <w:r>
+        <w:rPr>
+          <w:rFonts w:ascii="Times New Roman" w:hAnsi="Times New Roman" w:eastAsia="Batang"/>
+          <w:sz w:val="22"/>
+        </w:rPr>
+        <w:t>; and so on. No event, from any function, ever includes a cell value or a row's contents.</w:t>
+      </w:r>
+    </w:p>
+    <w:p>
+      <w:pPr>
+        <w:pStyle w:val="Heading2"/>
+      </w:pPr>
+      <w:r>
+        <w:rPr>
+          <w:rFonts w:ascii="Times New Roman" w:hAnsi="Times New Roman" w:eastAsia="Batang"/>
+          <w:b/>
+          <w:color w:val="000000"/>
+          <w:sz w:val="24"/>
+        </w:rPr>
+        <w:t xml:space="preserve">3. </w:t>
+      </w:r>
+      <w:r>
+        <w:rPr>
+          <w:rFonts w:ascii="Consolas" w:hAnsi="Consolas" w:eastAsia="Consolas"/>
+          <w:b/>
+          <w:color w:val="000000"/>
+          <w:sz w:val="24"/>
+        </w:rPr>
+        <w:t>row_count</w:t>
+      </w:r>
+      <w:r>
+        <w:rPr>
+          <w:rFonts w:ascii="Times New Roman" w:hAnsi="Times New Roman" w:eastAsia="Batang"/>
+          <w:b/>
+          <w:color w:val="000000"/>
+          <w:sz w:val="24"/>
+        </w:rPr>
+        <w:t xml:space="preserve">, </w:t>
+      </w:r>
+      <w:r>
+        <w:rPr>
+          <w:rFonts w:ascii="Consolas" w:hAnsi="Consolas" w:eastAsia="Consolas"/>
+          <w:b/>
+          <w:color w:val="000000"/>
+          <w:sz w:val="24"/>
+        </w:rPr>
+        <w:t>measure</w:t>
+      </w:r>
+    </w:p>
+    <w:p>
+      <w:pPr>
+        <w:spacing w:line="384" w:lineRule="auto" w:after="120"/>
+        <w:jc w:val="both"/>
+      </w:pPr>
+      <w:r>
+        <w:rPr>
+          <w:rFonts w:ascii="Consolas" w:hAnsi="Consolas" w:eastAsia="Consolas"/>
+          <w:sz w:val="18"/>
+        </w:rPr>
+        <w:t>row_count(obj)</w:t>
+      </w:r>
+      <w:r>
+        <w:rPr>
+          <w:rFonts w:ascii="Times New Roman" w:hAnsi="Times New Roman" w:eastAsia="Batang"/>
+          <w:sz w:val="22"/>
+        </w:rPr>
+        <w:t xml:space="preserve"> is the same best-effort helper the wrapped functions use internally (</w:t>
+      </w:r>
+      <w:r>
+        <w:rPr>
+          <w:rFonts w:ascii="Consolas" w:hAnsi="Consolas" w:eastAsia="Consolas"/>
+          <w:sz w:val="18"/>
+        </w:rPr>
+        <w:t>.num_rows</w:t>
+      </w:r>
+      <w:r>
+        <w:rPr>
+          <w:rFonts w:ascii="Times New Roman" w:hAnsi="Times New Roman" w:eastAsia="Batang"/>
+          <w:sz w:val="22"/>
+        </w:rPr>
+        <w:t xml:space="preserve"> for a </w:t>
+      </w:r>
+      <w:r>
+        <w:rPr>
+          <w:rFonts w:ascii="Consolas" w:hAnsi="Consolas" w:eastAsia="Consolas"/>
+          <w:sz w:val="18"/>
+        </w:rPr>
+        <w:t>RecordBatch</w:t>
+      </w:r>
+      <w:r>
+        <w:rPr>
+          <w:rFonts w:ascii="Times New Roman" w:hAnsi="Times New Roman" w:eastAsia="Batang"/>
+          <w:sz w:val="22"/>
+        </w:rPr>
+        <w:t xml:space="preserve">-like value, </w:t>
+      </w:r>
+      <w:r>
+        <w:rPr>
+          <w:rFonts w:ascii="Consolas" w:hAnsi="Consolas" w:eastAsia="Consolas"/>
+          <w:sz w:val="18"/>
+        </w:rPr>
+        <w:t>len()</w:t>
+      </w:r>
+      <w:r>
+        <w:rPr>
+          <w:rFonts w:ascii="Times New Roman" w:hAnsi="Times New Roman" w:eastAsia="Batang"/>
+          <w:sz w:val="22"/>
+        </w:rPr>
+        <w:t xml:space="preserve"> for an </w:t>
+      </w:r>
+      <w:r>
+        <w:rPr>
+          <w:rFonts w:ascii="Consolas" w:hAnsi="Consolas" w:eastAsia="Consolas"/>
+          <w:sz w:val="18"/>
+        </w:rPr>
+        <w:t>Array</w:t>
+      </w:r>
+      <w:r>
+        <w:rPr>
+          <w:rFonts w:ascii="Times New Roman" w:hAnsi="Times New Roman" w:eastAsia="Batang"/>
+          <w:sz w:val="22"/>
+        </w:rPr>
+        <w:t xml:space="preserve">-like value, </w:t>
+      </w:r>
+      <w:r>
+        <w:rPr>
+          <w:rFonts w:ascii="Consolas" w:hAnsi="Consolas" w:eastAsia="Consolas"/>
+          <w:sz w:val="18"/>
+        </w:rPr>
+        <w:t>None</w:t>
+      </w:r>
+      <w:r>
+        <w:rPr>
+          <w:rFonts w:ascii="Times New Roman" w:hAnsi="Times New Roman" w:eastAsia="Batang"/>
+          <w:sz w:val="22"/>
+        </w:rPr>
+        <w:t xml:space="preserve"> otherwise); useful for building a custom sink that wants to compute its own derived fields. </w:t>
+      </w:r>
+      <w:r>
+        <w:rPr>
+          <w:rFonts w:ascii="Consolas" w:hAnsi="Consolas" w:eastAsia="Consolas"/>
+          <w:sz w:val="18"/>
+        </w:rPr>
+        <w:t>measure(function, **context)</w:t>
+      </w:r>
+      <w:r>
+        <w:rPr>
+          <w:rFonts w:ascii="Times New Roman" w:hAnsi="Times New Roman" w:eastAsia="Batang"/>
+          <w:sz w:val="22"/>
+        </w:rPr>
+        <w:t xml:space="preserve"> is the context manager every wrapped function is built on; call it directly to instrument your own code the same way, including calls into functions this module does not already wrap.</w:t>
+      </w:r>
+    </w:p>
+    <w:p>
+      <w:pPr>
+        <w:pStyle w:val="Heading1"/>
+      </w:pPr>
+      <w:r>
+        <w:rPr>
+          <w:rFonts w:ascii="Times New Roman" w:hAnsi="Times New Roman" w:eastAsia="Batang"/>
+          <w:b/>
+          <w:color w:val="000000"/>
+          <w:sz w:val="26"/>
+        </w:rPr>
+        <w:t>V. Rust Surface</w:t>
       </w:r>
     </w:p>
     <w:p>
@@ -8213,7 +9454,7 @@
           <w:rFonts w:ascii="Times New Roman" w:hAnsi="Times New Roman" w:eastAsia="Batang"/>
           <w:sz w:val="22"/>
         </w:rPr>
-        <w:t>&lt;Table 4-1&gt; Public Rust modules</w:t>
+        <w:t>&lt;Table 5-1&gt; Public Rust modules</w:t>
       </w:r>
     </w:p>
     <w:tbl>
@@ -9153,7 +10394,7 @@
           <w:color w:val="000000"/>
           <w:sz w:val="26"/>
         </w:rPr>
-        <w:t>V. Semantics Callers Must Know</w:t>
+        <w:t>VI. Semantics Callers Must Know</w:t>
       </w:r>
     </w:p>
     <w:p>
@@ -10675,7 +11916,7 @@
           <w:color w:val="000000"/>
           <w:sz w:val="26"/>
         </w:rPr>
-        <w:t>VI. Worked Examples</w:t>
+        <w:t>VII. Worked Examples</w:t>
       </w:r>
     </w:p>
     <w:p>
@@ -10965,7 +12206,72 @@
           <w:color w:val="000000"/>
           <w:sz w:val="24"/>
         </w:rPr>
-        <w:t>7. Calling from Rust</w:t>
+        <w:t>7. Measuring latency and throughput</w:t>
+      </w:r>
+    </w:p>
+    <w:p>
+      <w:pPr>
+        <w:spacing w:line="240" w:lineRule="auto" w:before="120" w:after="120"/>
+        <w:ind w:left="454"/>
+      </w:pPr>
+      <w:r>
+        <w:rPr>
+          <w:rFonts w:ascii="Consolas" w:hAnsi="Consolas" w:eastAsia="Consolas"/>
+          <w:sz w:val="18"/>
+        </w:rPr>
+        <w:t>witchhat.metrics.enable()  # JSON lines to stdout</w:t>
+        <w:br/>
+        <w:br/>
+        <w:t>witchhat.hash_rows(batch, ["id", "email"])</w:t>
+        <w:br/>
+        <w:t># {"columns":["id","email"],"version":"v1","function":"hash_rows","ts":"...",</w:t>
+        <w:br/>
+        <w:t>#  "status":"ok","rows_in":4,"rows_out":4,"duration_ms":0.15,"rows_per_second":26666.7}</w:t>
+        <w:br/>
+        <w:br/>
+        <w:t>witchhat.metrics.disable()</w:t>
+      </w:r>
+    </w:p>
+    <w:p>
+      <w:pPr>
+        <w:spacing w:line="384" w:lineRule="auto" w:after="120"/>
+        <w:jc w:val="both"/>
+      </w:pPr>
+      <w:r>
+        <w:rPr>
+          <w:rFonts w:ascii="Times New Roman" w:hAnsi="Times New Roman" w:eastAsia="Batang"/>
+          <w:sz w:val="22"/>
+        </w:rPr>
+        <w:t>Route events elsewhere instead of stdout by passing a sink:</w:t>
+      </w:r>
+    </w:p>
+    <w:p>
+      <w:pPr>
+        <w:spacing w:line="240" w:lineRule="auto" w:before="120" w:after="120"/>
+        <w:ind w:left="454"/>
+      </w:pPr>
+      <w:r>
+        <w:rPr>
+          <w:rFonts w:ascii="Consolas" w:hAnsi="Consolas" w:eastAsia="Consolas"/>
+          <w:sz w:val="18"/>
+        </w:rPr>
+        <w:t>events = []</w:t>
+        <w:br/>
+        <w:t>witchhat.metrics.enable(sink=events.append)  # or sink="/path/to/log.jsonl"</w:t>
+      </w:r>
+    </w:p>
+    <w:p>
+      <w:pPr>
+        <w:pStyle w:val="Heading2"/>
+      </w:pPr>
+      <w:r>
+        <w:rPr>
+          <w:rFonts w:ascii="Times New Roman" w:hAnsi="Times New Roman" w:eastAsia="Batang"/>
+          <w:b/>
+          <w:color w:val="000000"/>
+          <w:sz w:val="24"/>
+        </w:rPr>
+        <w:t>8. Calling from Rust</w:t>
       </w:r>
     </w:p>
     <w:p>

</xml_diff>